<commit_message>
ADDING TODAY'S WORK - 19.06.2026
</commit_message>
<xml_diff>
--- a/write_up/drafts/2_introduction/introduction_plan.docx
+++ b/write_up/drafts/2_introduction/introduction_plan.docx
@@ -1,8 +1,56 @@
 
 <file path=word/document.xml><?xml version="1.0" encoding="utf-8"?>
-<w:document xmlns:wpc="http://schemas.microsoft.com/office/word/2010/wordprocessingCanvas" xmlns:cx="http://schemas.microsoft.com/office/drawing/2014/chartex" xmlns:cx1="http://schemas.microsoft.com/office/drawing/2015/9/8/chartex" xmlns:cx2="http://schemas.microsoft.com/office/drawing/2015/10/21/chartex" xmlns:cx3="http://schemas.microsoft.com/office/drawing/2016/5/9/chartex" xmlns:cx4="http://schemas.microsoft.com/office/drawing/2016/5/10/chartex" xmlns:cx5="http://schemas.microsoft.com/office/drawing/2016/5/11/chartex" xmlns:cx6="http://schemas.microsoft.com/office/drawing/2016/5/12/chartex" xmlns:cx7="http://schemas.microsoft.com/office/drawing/2016/5/13/chartex" xmlns:cx8="http://schemas.microsoft.com/office/drawing/2016/5/14/chartex" xmlns:mc="http://schemas.openxmlformats.org/markup-compatibility/2006" xmlns:aink="http://schemas.microsoft.com/office/drawing/2016/ink" xmlns:am3d="http://schemas.microsoft.com/office/drawing/2017/model3d" xmlns:o="urn:schemas-microsoft-com:office:office" xmlns:oel="http://schemas.microsoft.com/office/2019/extlst" xmlns:r="http://schemas.openxmlformats.org/officeDocument/2006/relationships" xmlns:m="http://schemas.openxmlformats.org/officeDocument/2006/math" xmlns:v="urn:schemas-microsoft-com:vml" xmlns:wp14="http://schemas.microsoft.com/office/word/2010/wordprocessingDrawing" xmlns:wp="http://schemas.openxmlformats.org/drawingml/2006/wordprocessingDrawing" xmlns:w10="urn:schemas-microsoft-com:office:word" xmlns:w="http://schemas.openxmlformats.org/wordprocessingml/2006/main" xmlns:w14="http://schemas.microsoft.com/office/word/2010/wordml" xmlns:w15="http://schemas.microsoft.com/office/word/2012/wordml" xmlns:w16cex="http://schemas.microsoft.com/office/word/2018/wordml/cex" xmlns:w16cid="http://schemas.microsoft.com/office/word/2016/wordml/cid" xmlns:w16="http://schemas.microsoft.com/office/word/2018/wordml" xmlns:w16du="http://schemas.microsoft.com/office/word/2023/wordml/word16du" xmlns:w16sdtdh="http://schemas.microsoft.com/office/word/2020/wordml/sdtdatahash" xmlns:w16sdtfl="http://schemas.microsoft.com/office/word/2024/wordml/sdtformatlock" xmlns:w16se="http://schemas.microsoft.com/office/word/2015/wordml/symex" xmlns:wpg="http://schemas.microsoft.com/office/word/2010/wordprocessingGroup" xmlns:wpi="http://schemas.microsoft.com/office/word/2010/wordprocessingInk" xmlns:wne="http://schemas.microsoft.com/office/word/2006/wordml" xmlns:wps="http://schemas.microsoft.com/office/word/2010/wordprocessingShape" mc:Ignorable="w14 w15 w16se w16cid w16 w16cex w16sdtdh w16sdtfl w16du wp14">
+<w:document xmlns:wpc="http://schemas.microsoft.com/office/word/2010/wordprocessingCanvas" xmlns:cx="http://schemas.microsoft.com/office/drawing/2014/chartex" xmlns:cx1="http://schemas.microsoft.com/office/drawing/2015/9/8/chartex" xmlns:cx2="http://schemas.microsoft.com/office/drawing/2015/10/21/chartex" xmlns:cx3="http://schemas.microsoft.com/office/drawing/2016/5/9/chartex" xmlns:cx4="http://schemas.microsoft.com/office/drawing/2016/5/10/chartex" xmlns:cx5="http://schemas.microsoft.com/office/drawing/2016/5/11/chartex" xmlns:cx6="http://schemas.microsoft.com/office/drawing/2016/5/12/chartex" xmlns:cx7="http://schemas.microsoft.com/office/drawing/2016/5/13/chartex" xmlns:cx8="http://schemas.microsoft.com/office/drawing/2016/5/14/chartex" xmlns:mc="http://schemas.openxmlformats.org/markup-compatibility/2006" xmlns:m="http://schemas.openxmlformats.org/officeDocument/2006/math" xmlns:aink="http://schemas.microsoft.com/office/drawing/2016/ink" xmlns:am3d="http://schemas.microsoft.com/office/drawing/2017/model3d" xmlns:oel="http://schemas.microsoft.com/office/2019/extlst" xmlns:r="http://schemas.openxmlformats.org/officeDocument/2006/relationships" xmlns:wp14="http://schemas.microsoft.com/office/word/2010/wordprocessingDrawing" xmlns:wp="http://schemas.openxmlformats.org/drawingml/2006/wordprocessingDrawing" xmlns:wpg="http://schemas.microsoft.com/office/word/2010/wordprocessingGroup" xmlns:wpi="http://schemas.microsoft.com/office/word/2010/wordprocessingInk" xmlns:wps="http://schemas.microsoft.com/office/word/2010/wordprocessingShape" xmlns:o="urn:schemas-microsoft-com:office:office" xmlns:v="urn:schemas-microsoft-com:vml" xmlns:w10="urn:schemas-microsoft-com:office:word" xmlns:w="http://schemas.openxmlformats.org/wordprocessingml/2006/main" xmlns:w14="http://schemas.microsoft.com/office/word/2010/wordml" xmlns:w15="http://schemas.microsoft.com/office/word/2012/wordml" xmlns:w16cex="http://schemas.microsoft.com/office/word/2018/wordml/cex" xmlns:w16cid="http://schemas.microsoft.com/office/word/2016/wordml/cid" xmlns:w16="http://schemas.microsoft.com/office/word/2018/wordml" xmlns:w16sdtdh="http://schemas.microsoft.com/office/word/2020/wordml/sdtdatahash" xmlns:w16sdtfl="http://schemas.microsoft.com/office/word/2024/wordml/sdtformatlock" xmlns:w16se="http://schemas.microsoft.com/office/word/2015/wordml/symex" xmlns:w16du="http://schemas.microsoft.com/office/word/2023/wordml/word16du" xmlns:wne="http://schemas.microsoft.com/office/word/2006/wordml" mc:Ignorable="w14 w15 w16se w16cid w16 w16cex w16sdtdh w16sdtfl w16du wp14">
   <w:body>
-    <w:p/>
+    <w:p>
+      <w:pPr>
+        <w:ind w:left="720" w:hanging="360"/>
+        <w:rPr>
+          <w:b/>
+          <w:bCs/>
+        </w:rPr>
+      </w:pPr>
+      <w:r>
+        <w:rPr>
+          <w:b/>
+          <w:bCs/>
+        </w:rPr>
+        <w:t>Plan</w:t>
+      </w:r>
+    </w:p>
+    <w:p>
+      <w:pPr>
+        <w:pStyle w:val="ListParagraph"/>
+        <w:numPr>
+          <w:ilvl w:val="0"/>
+          <w:numId w:val="2"/>
+        </w:numPr>
+      </w:pPr>
+      <w:r>
+        <w:t>Intro to exosomes</w:t>
+      </w:r>
+    </w:p>
+    <w:p>
+      <w:pPr>
+        <w:pStyle w:val="ListParagraph"/>
+        <w:numPr>
+          <w:ilvl w:val="0"/>
+          <w:numId w:val="2"/>
+        </w:numPr>
+      </w:pPr>
+      <w:r>
+        <w:t xml:space="preserve">Intro to miRNAs </w:t>
+      </w:r>
+    </w:p>
+    <w:p>
+      <w:pPr>
+        <w:pStyle w:val="ListParagraph"/>
+        <w:numPr>
+          <w:ilvl w:val="0"/>
+          <w:numId w:val="2"/>
+        </w:numPr>
+      </w:pPr>
+    </w:p>
     <w:sectPr>
       <w:pgSz w:w="11906" w:h="16838"/>
       <w:pgMar w:top="1440" w:right="1440" w:bottom="1440" w:left="1440" w:header="708" w:footer="708" w:gutter="0"/>
@@ -14,8 +62,121 @@
 </file>
 
 <file path=word/numbering.xml><?xml version="1.0" encoding="utf-8"?>
-<w:numbering xmlns:wpc="http://schemas.microsoft.com/office/word/2010/wordprocessingCanvas" xmlns:cx="http://schemas.microsoft.com/office/drawing/2014/chartex" xmlns:cx1="http://schemas.microsoft.com/office/drawing/2015/9/8/chartex" xmlns:cx2="http://schemas.microsoft.com/office/drawing/2015/10/21/chartex" xmlns:cx3="http://schemas.microsoft.com/office/drawing/2016/5/9/chartex" xmlns:cx4="http://schemas.microsoft.com/office/drawing/2016/5/10/chartex" xmlns:cx5="http://schemas.microsoft.com/office/drawing/2016/5/11/chartex" xmlns:cx6="http://schemas.microsoft.com/office/drawing/2016/5/12/chartex" xmlns:cx7="http://schemas.microsoft.com/office/drawing/2016/5/13/chartex" xmlns:cx8="http://schemas.microsoft.com/office/drawing/2016/5/14/chartex" xmlns:mc="http://schemas.openxmlformats.org/markup-compatibility/2006" xmlns:aink="http://schemas.microsoft.com/office/drawing/2016/ink" xmlns:am3d="http://schemas.microsoft.com/office/drawing/2017/model3d" xmlns:o="urn:schemas-microsoft-com:office:office" xmlns:oel="http://schemas.microsoft.com/office/2019/extlst" xmlns:r="http://schemas.openxmlformats.org/officeDocument/2006/relationships" xmlns:m="http://schemas.openxmlformats.org/officeDocument/2006/math" xmlns:v="urn:schemas-microsoft-com:vml" xmlns:wp14="http://schemas.microsoft.com/office/word/2010/wordprocessingDrawing" xmlns:wp="http://schemas.openxmlformats.org/drawingml/2006/wordprocessingDrawing" xmlns:w10="urn:schemas-microsoft-com:office:word" xmlns:w="http://schemas.openxmlformats.org/wordprocessingml/2006/main" xmlns:w14="http://schemas.microsoft.com/office/word/2010/wordml" xmlns:w15="http://schemas.microsoft.com/office/word/2012/wordml" xmlns:w16cex="http://schemas.microsoft.com/office/word/2018/wordml/cex" xmlns:w16cid="http://schemas.microsoft.com/office/word/2016/wordml/cid" xmlns:w16="http://schemas.microsoft.com/office/word/2018/wordml" xmlns:w16du="http://schemas.microsoft.com/office/word/2023/wordml/word16du" xmlns:w16sdtdh="http://schemas.microsoft.com/office/word/2020/wordml/sdtdatahash" xmlns:w16sdtfl="http://schemas.microsoft.com/office/word/2024/wordml/sdtformatlock" xmlns:w16se="http://schemas.microsoft.com/office/word/2015/wordml/symex" xmlns:wpg="http://schemas.microsoft.com/office/word/2010/wordprocessingGroup" xmlns:wpi="http://schemas.microsoft.com/office/word/2010/wordprocessingInk" xmlns:wne="http://schemas.microsoft.com/office/word/2006/wordml" xmlns:wps="http://schemas.microsoft.com/office/word/2010/wordprocessingShape" mc:Ignorable="w14 w15 w16se w16cid w16 w16cex w16sdtdh w16sdtfl w16du wp14">
+<w:numbering xmlns:wpc="http://schemas.microsoft.com/office/word/2010/wordprocessingCanvas" xmlns:cx="http://schemas.microsoft.com/office/drawing/2014/chartex" xmlns:cx1="http://schemas.microsoft.com/office/drawing/2015/9/8/chartex" xmlns:cx2="http://schemas.microsoft.com/office/drawing/2015/10/21/chartex" xmlns:cx3="http://schemas.microsoft.com/office/drawing/2016/5/9/chartex" xmlns:cx4="http://schemas.microsoft.com/office/drawing/2016/5/10/chartex" xmlns:cx5="http://schemas.microsoft.com/office/drawing/2016/5/11/chartex" xmlns:cx6="http://schemas.microsoft.com/office/drawing/2016/5/12/chartex" xmlns:cx7="http://schemas.microsoft.com/office/drawing/2016/5/13/chartex" xmlns:cx8="http://schemas.microsoft.com/office/drawing/2016/5/14/chartex" xmlns:mc="http://schemas.openxmlformats.org/markup-compatibility/2006" xmlns:m="http://schemas.openxmlformats.org/officeDocument/2006/math" xmlns:aink="http://schemas.microsoft.com/office/drawing/2016/ink" xmlns:am3d="http://schemas.microsoft.com/office/drawing/2017/model3d" xmlns:oel="http://schemas.microsoft.com/office/2019/extlst" xmlns:r="http://schemas.openxmlformats.org/officeDocument/2006/relationships" xmlns:wp14="http://schemas.microsoft.com/office/word/2010/wordprocessingDrawing" xmlns:wp="http://schemas.openxmlformats.org/drawingml/2006/wordprocessingDrawing" xmlns:wpg="http://schemas.microsoft.com/office/word/2010/wordprocessingGroup" xmlns:wpi="http://schemas.microsoft.com/office/word/2010/wordprocessingInk" xmlns:wps="http://schemas.microsoft.com/office/word/2010/wordprocessingShape" xmlns:o="urn:schemas-microsoft-com:office:office" xmlns:v="urn:schemas-microsoft-com:vml" xmlns:w10="urn:schemas-microsoft-com:office:word" xmlns:w="http://schemas.openxmlformats.org/wordprocessingml/2006/main" xmlns:w14="http://schemas.microsoft.com/office/word/2010/wordml" xmlns:w15="http://schemas.microsoft.com/office/word/2012/wordml" xmlns:w16cex="http://schemas.microsoft.com/office/word/2018/wordml/cex" xmlns:w16cid="http://schemas.microsoft.com/office/word/2016/wordml/cid" xmlns:w16="http://schemas.microsoft.com/office/word/2018/wordml" xmlns:w16sdtdh="http://schemas.microsoft.com/office/word/2020/wordml/sdtdatahash" xmlns:w16sdtfl="http://schemas.microsoft.com/office/word/2024/wordml/sdtformatlock" xmlns:w16se="http://schemas.microsoft.com/office/word/2015/wordml/symex" xmlns:w16du="http://schemas.microsoft.com/office/word/2023/wordml/word16du" xmlns:wne="http://schemas.microsoft.com/office/word/2006/wordml" mc:Ignorable="w14 w15 w16se w16cid w16 w16cex w16sdtdh w16sdtfl w16du wp14">
   <w:abstractNum w:abstractNumId="0" w15:restartNumberingAfterBreak="0">
+    <w:nsid w:val="14C612B6"/>
+    <w:multiLevelType w:val="hybridMultilevel"/>
+    <w:tmpl w:val="00A29352"/>
+    <w:lvl w:ilvl="0" w:tplc="08090001">
+      <w:start w:val="1"/>
+      <w:numFmt w:val="bullet"/>
+      <w:lvlText w:val=""/>
+      <w:lvlJc w:val="left"/>
+      <w:pPr>
+        <w:ind w:left="720" w:hanging="360"/>
+      </w:pPr>
+      <w:rPr>
+        <w:rFonts w:ascii="Symbol" w:hAnsi="Symbol" w:hint="default"/>
+      </w:rPr>
+    </w:lvl>
+    <w:lvl w:ilvl="1" w:tplc="08090003" w:tentative="1">
+      <w:start w:val="1"/>
+      <w:numFmt w:val="bullet"/>
+      <w:lvlText w:val="o"/>
+      <w:lvlJc w:val="left"/>
+      <w:pPr>
+        <w:ind w:left="1440" w:hanging="360"/>
+      </w:pPr>
+      <w:rPr>
+        <w:rFonts w:ascii="Courier New" w:hAnsi="Courier New" w:cs="Courier New" w:hint="default"/>
+      </w:rPr>
+    </w:lvl>
+    <w:lvl w:ilvl="2" w:tplc="08090005" w:tentative="1">
+      <w:start w:val="1"/>
+      <w:numFmt w:val="bullet"/>
+      <w:lvlText w:val=""/>
+      <w:lvlJc w:val="left"/>
+      <w:pPr>
+        <w:ind w:left="2160" w:hanging="360"/>
+      </w:pPr>
+      <w:rPr>
+        <w:rFonts w:ascii="Wingdings" w:hAnsi="Wingdings" w:hint="default"/>
+      </w:rPr>
+    </w:lvl>
+    <w:lvl w:ilvl="3" w:tplc="08090001" w:tentative="1">
+      <w:start w:val="1"/>
+      <w:numFmt w:val="bullet"/>
+      <w:lvlText w:val=""/>
+      <w:lvlJc w:val="left"/>
+      <w:pPr>
+        <w:ind w:left="2880" w:hanging="360"/>
+      </w:pPr>
+      <w:rPr>
+        <w:rFonts w:ascii="Symbol" w:hAnsi="Symbol" w:hint="default"/>
+      </w:rPr>
+    </w:lvl>
+    <w:lvl w:ilvl="4" w:tplc="08090003" w:tentative="1">
+      <w:start w:val="1"/>
+      <w:numFmt w:val="bullet"/>
+      <w:lvlText w:val="o"/>
+      <w:lvlJc w:val="left"/>
+      <w:pPr>
+        <w:ind w:left="3600" w:hanging="360"/>
+      </w:pPr>
+      <w:rPr>
+        <w:rFonts w:ascii="Courier New" w:hAnsi="Courier New" w:cs="Courier New" w:hint="default"/>
+      </w:rPr>
+    </w:lvl>
+    <w:lvl w:ilvl="5" w:tplc="08090005" w:tentative="1">
+      <w:start w:val="1"/>
+      <w:numFmt w:val="bullet"/>
+      <w:lvlText w:val=""/>
+      <w:lvlJc w:val="left"/>
+      <w:pPr>
+        <w:ind w:left="4320" w:hanging="360"/>
+      </w:pPr>
+      <w:rPr>
+        <w:rFonts w:ascii="Wingdings" w:hAnsi="Wingdings" w:hint="default"/>
+      </w:rPr>
+    </w:lvl>
+    <w:lvl w:ilvl="6" w:tplc="08090001" w:tentative="1">
+      <w:start w:val="1"/>
+      <w:numFmt w:val="bullet"/>
+      <w:lvlText w:val=""/>
+      <w:lvlJc w:val="left"/>
+      <w:pPr>
+        <w:ind w:left="5040" w:hanging="360"/>
+      </w:pPr>
+      <w:rPr>
+        <w:rFonts w:ascii="Symbol" w:hAnsi="Symbol" w:hint="default"/>
+      </w:rPr>
+    </w:lvl>
+    <w:lvl w:ilvl="7" w:tplc="08090003" w:tentative="1">
+      <w:start w:val="1"/>
+      <w:numFmt w:val="bullet"/>
+      <w:lvlText w:val="o"/>
+      <w:lvlJc w:val="left"/>
+      <w:pPr>
+        <w:ind w:left="5760" w:hanging="360"/>
+      </w:pPr>
+      <w:rPr>
+        <w:rFonts w:ascii="Courier New" w:hAnsi="Courier New" w:cs="Courier New" w:hint="default"/>
+      </w:rPr>
+    </w:lvl>
+    <w:lvl w:ilvl="8" w:tplc="08090005" w:tentative="1">
+      <w:start w:val="1"/>
+      <w:numFmt w:val="bullet"/>
+      <w:lvlText w:val=""/>
+      <w:lvlJc w:val="left"/>
+      <w:pPr>
+        <w:ind w:left="6480" w:hanging="360"/>
+      </w:pPr>
+      <w:rPr>
+        <w:rFonts w:ascii="Wingdings" w:hAnsi="Wingdings" w:hint="default"/>
+      </w:rPr>
+    </w:lvl>
+  </w:abstractNum>
+  <w:abstractNum w:abstractNumId="1" w15:restartNumberingAfterBreak="0">
     <w:nsid w:val="746A5C0A"/>
     <w:multiLevelType w:val="hybridMultilevel"/>
     <w:tmpl w:val="50DEA51A"/>
@@ -129,13 +290,16 @@
     </w:lvl>
   </w:abstractNum>
   <w:num w:numId="1" w16cid:durableId="853226515">
+    <w:abstractNumId w:val="1"/>
+  </w:num>
+  <w:num w:numId="2" w16cid:durableId="1165441885">
     <w:abstractNumId w:val="0"/>
   </w:num>
 </w:numbering>
 </file>
 
 <file path=word/styles.xml><?xml version="1.0" encoding="utf-8"?>
-<w:styles xmlns:mc="http://schemas.openxmlformats.org/markup-compatibility/2006" xmlns:r="http://schemas.openxmlformats.org/officeDocument/2006/relationships" xmlns:w="http://schemas.openxmlformats.org/wordprocessingml/2006/main" xmlns:w14="http://schemas.microsoft.com/office/word/2010/wordml" xmlns:w15="http://schemas.microsoft.com/office/word/2012/wordml" xmlns:w16cex="http://schemas.microsoft.com/office/word/2018/wordml/cex" xmlns:w16cid="http://schemas.microsoft.com/office/word/2016/wordml/cid" xmlns:w16="http://schemas.microsoft.com/office/word/2018/wordml" xmlns:w16du="http://schemas.microsoft.com/office/word/2023/wordml/word16du" xmlns:w16sdtdh="http://schemas.microsoft.com/office/word/2020/wordml/sdtdatahash" xmlns:w16sdtfl="http://schemas.microsoft.com/office/word/2024/wordml/sdtformatlock" xmlns:w16se="http://schemas.microsoft.com/office/word/2015/wordml/symex" mc:Ignorable="w14 w15 w16se w16cid w16 w16cex w16sdtdh w16sdtfl w16du">
+<w:styles xmlns:mc="http://schemas.openxmlformats.org/markup-compatibility/2006" xmlns:r="http://schemas.openxmlformats.org/officeDocument/2006/relationships" xmlns:w="http://schemas.openxmlformats.org/wordprocessingml/2006/main" xmlns:w14="http://schemas.microsoft.com/office/word/2010/wordml" xmlns:w15="http://schemas.microsoft.com/office/word/2012/wordml" xmlns:w16cex="http://schemas.microsoft.com/office/word/2018/wordml/cex" xmlns:w16cid="http://schemas.microsoft.com/office/word/2016/wordml/cid" xmlns:w16="http://schemas.microsoft.com/office/word/2018/wordml" xmlns:w16sdtdh="http://schemas.microsoft.com/office/word/2020/wordml/sdtdatahash" xmlns:w16sdtfl="http://schemas.microsoft.com/office/word/2024/wordml/sdtformatlock" xmlns:w16se="http://schemas.microsoft.com/office/word/2015/wordml/symex" xmlns:w16du="http://schemas.microsoft.com/office/word/2023/wordml/word16du" mc:Ignorable="w14 w15 w16se w16cid w16 w16cex w16sdtdh w16sdtfl w16du">
   <w:docDefaults>
     <w:rPrDefault>
       <w:rPr>

</xml_diff>

<commit_message>
ADDING TODAY'S WORK - 23.06.2026
</commit_message>
<xml_diff>
--- a/write_up/drafts/2_introduction/introduction_plan.docx
+++ b/write_up/drafts/2_introduction/introduction_plan.docx
@@ -27,7 +27,21 @@
         </w:numPr>
       </w:pPr>
       <w:r>
-        <w:t>Intro to exosomes</w:t>
+        <w:t>Intro to</w:t>
+      </w:r>
+      <w:r>
+        <w:t xml:space="preserve"> </w:t>
+      </w:r>
+      <w:proofErr w:type="spellStart"/>
+      <w:r>
+        <w:t>hbec</w:t>
+      </w:r>
+      <w:proofErr w:type="spellEnd"/>
+      <w:r>
+        <w:t>/</w:t>
+      </w:r>
+      <w:r>
+        <w:t>exosomes</w:t>
       </w:r>
     </w:p>
     <w:p>
@@ -41,6 +55,9 @@
       <w:r>
         <w:t xml:space="preserve">Intro to miRNAs </w:t>
       </w:r>
+      <w:r>
+        <w:t>(incl. as regulators)</w:t>
+      </w:r>
     </w:p>
     <w:p>
       <w:pPr>
@@ -51,8 +68,407 @@
         </w:numPr>
       </w:pPr>
       <w:r>
+        <w:t xml:space="preserve">Intro </w:t>
+      </w:r>
+      <w:r>
+        <w:t xml:space="preserve">to differential expression analysis for </w:t>
+      </w:r>
+      <w:proofErr w:type="spellStart"/>
+      <w:r>
+        <w:t>mirnas</w:t>
+      </w:r>
+      <w:proofErr w:type="spellEnd"/>
+    </w:p>
+    <w:p>
+      <w:pPr>
+        <w:pStyle w:val="ListParagraph"/>
+        <w:numPr>
+          <w:ilvl w:val="0"/>
+          <w:numId w:val="2"/>
+        </w:numPr>
+      </w:pPr>
+      <w:r>
+        <w:t xml:space="preserve">Intro to FE for </w:t>
+      </w:r>
+      <w:proofErr w:type="spellStart"/>
+      <w:r>
+        <w:t>mirnas</w:t>
+      </w:r>
+      <w:proofErr w:type="spellEnd"/>
+      <w:r>
+        <w:t xml:space="preserve"> (all the different methods)</w:t>
+      </w:r>
+    </w:p>
+    <w:p>
+      <w:pPr>
+        <w:pStyle w:val="ListParagraph"/>
+        <w:numPr>
+          <w:ilvl w:val="0"/>
+          <w:numId w:val="2"/>
+        </w:numPr>
+      </w:pPr>
+      <w:r>
         <w:t>Tami results only provided after my execution of the analysis pipeline to maintain single blind conditions</w:t>
       </w:r>
+    </w:p>
+    <w:p/>
+    <w:p>
+      <w:pPr>
+        <w:ind w:left="360"/>
+      </w:pPr>
+      <w:r>
+        <w:rPr>
+          <w:u w:val="single"/>
+        </w:rPr>
+        <w:t>Paragraph 1</w:t>
+      </w:r>
+    </w:p>
+    <w:p>
+      <w:pPr>
+        <w:ind w:left="360"/>
+        <w:rPr>
+          <w:b/>
+          <w:bCs/>
+        </w:rPr>
+      </w:pPr>
+      <w:r>
+        <w:rPr>
+          <w:b/>
+          <w:bCs/>
+        </w:rPr>
+        <w:t xml:space="preserve">The </w:t>
+      </w:r>
+      <w:r>
+        <w:rPr>
+          <w:b/>
+          <w:bCs/>
+        </w:rPr>
+        <w:t>big question / establishing a territory.</w:t>
+      </w:r>
+    </w:p>
+    <w:p>
+      <w:pPr>
+        <w:ind w:left="360"/>
+      </w:pPr>
+      <w:r>
+        <w:t>Allergen effect on EVs and the epithelial barrier.</w:t>
+      </w:r>
+      <w:r>
+        <w:t xml:space="preserve"> [LF stated to cover this topic]</w:t>
+      </w:r>
+    </w:p>
+    <w:p>
+      <w:pPr>
+        <w:ind w:left="360"/>
+      </w:pPr>
+    </w:p>
+    <w:p>
+      <w:pPr>
+        <w:ind w:left="360"/>
+      </w:pPr>
+      <w:r>
+        <w:rPr>
+          <w:u w:val="single"/>
+        </w:rPr>
+        <w:t xml:space="preserve">Paragraph </w:t>
+      </w:r>
+      <w:r>
+        <w:rPr>
+          <w:u w:val="single"/>
+        </w:rPr>
+        <w:t>2</w:t>
+      </w:r>
+    </w:p>
+    <w:p>
+      <w:pPr>
+        <w:ind w:left="360"/>
+        <w:rPr>
+          <w:b/>
+          <w:bCs/>
+        </w:rPr>
+      </w:pPr>
+      <w:r>
+        <w:rPr>
+          <w:b/>
+          <w:bCs/>
+        </w:rPr>
+        <w:t>What is known.</w:t>
+      </w:r>
+    </w:p>
+    <w:p>
+      <w:pPr>
+        <w:ind w:left="360"/>
+      </w:pPr>
+      <w:r>
+        <w:t xml:space="preserve">HBECs </w:t>
+      </w:r>
+      <w:r>
+        <w:sym w:font="Wingdings" w:char="F0E0"/>
+      </w:r>
+      <w:r>
+        <w:t xml:space="preserve"> EVs </w:t>
+      </w:r>
+      <w:r>
+        <w:sym w:font="Wingdings" w:char="F0E0"/>
+      </w:r>
+      <w:r>
+        <w:t xml:space="preserve"> miRNAs </w:t>
+      </w:r>
+      <w:r>
+        <w:sym w:font="Wingdings" w:char="F0E0"/>
+      </w:r>
+      <w:r>
+        <w:t xml:space="preserve"> immune/inflammatory responses + respiratory diseases</w:t>
+      </w:r>
+    </w:p>
+    <w:p>
+      <w:pPr>
+        <w:ind w:left="360"/>
+      </w:pPr>
+      <w:r>
+        <w:t xml:space="preserve">Effect of </w:t>
+      </w:r>
+      <w:r>
+        <w:t>Protease/HDM/Dog allergens</w:t>
+      </w:r>
+      <w:r>
+        <w:t xml:space="preserve"> on HBECs.</w:t>
+      </w:r>
+    </w:p>
+    <w:p>
+      <w:pPr>
+        <w:ind w:left="360"/>
+      </w:pPr>
+    </w:p>
+    <w:p>
+      <w:pPr>
+        <w:ind w:left="360"/>
+      </w:pPr>
+      <w:r>
+        <w:rPr>
+          <w:u w:val="single"/>
+        </w:rPr>
+        <w:t xml:space="preserve">Paragraph </w:t>
+      </w:r>
+      <w:r>
+        <w:rPr>
+          <w:u w:val="single"/>
+        </w:rPr>
+        <w:t>3</w:t>
+      </w:r>
+    </w:p>
+    <w:p>
+      <w:pPr>
+        <w:ind w:left="360"/>
+        <w:rPr>
+          <w:b/>
+          <w:bCs/>
+        </w:rPr>
+      </w:pPr>
+      <w:r>
+        <w:rPr>
+          <w:b/>
+          <w:bCs/>
+        </w:rPr>
+        <w:t>What is unknown</w:t>
+      </w:r>
+      <w:r>
+        <w:rPr>
+          <w:b/>
+          <w:bCs/>
+        </w:rPr>
+        <w:t xml:space="preserve"> / the gap/niche that needs to be filled.</w:t>
+      </w:r>
+    </w:p>
+    <w:p>
+      <w:pPr>
+        <w:ind w:left="360"/>
+      </w:pPr>
+      <w:r>
+        <w:t>Cell type effect (primary HBEC vs Calu-3)</w:t>
+      </w:r>
+      <w:r>
+        <w:t>.</w:t>
+      </w:r>
+    </w:p>
+    <w:p>
+      <w:pPr>
+        <w:ind w:left="360"/>
+      </w:pPr>
+      <w:r>
+        <w:t>Anything that the company/Lucy wanted to find out.</w:t>
+      </w:r>
+    </w:p>
+    <w:p>
+      <w:pPr>
+        <w:ind w:left="360"/>
+      </w:pPr>
+    </w:p>
+    <w:p>
+      <w:pPr>
+        <w:ind w:left="360"/>
+      </w:pPr>
+      <w:r>
+        <w:rPr>
+          <w:u w:val="single"/>
+        </w:rPr>
+        <w:t xml:space="preserve">Paragraph </w:t>
+      </w:r>
+      <w:r>
+        <w:rPr>
+          <w:u w:val="single"/>
+        </w:rPr>
+        <w:t>4</w:t>
+      </w:r>
+    </w:p>
+    <w:p>
+      <w:pPr>
+        <w:ind w:left="360"/>
+        <w:rPr>
+          <w:b/>
+          <w:bCs/>
+        </w:rPr>
+      </w:pPr>
+      <w:r>
+        <w:rPr>
+          <w:b/>
+          <w:bCs/>
+        </w:rPr>
+        <w:t>Technical details</w:t>
+      </w:r>
+      <w:r>
+        <w:rPr>
+          <w:b/>
+          <w:bCs/>
+        </w:rPr>
+        <w:t>.</w:t>
+      </w:r>
+    </w:p>
+    <w:p>
+      <w:pPr>
+        <w:ind w:left="360"/>
+      </w:pPr>
+      <w:r>
+        <w:t>Methods to perform DE analysis.</w:t>
+      </w:r>
+    </w:p>
+    <w:p>
+      <w:pPr>
+        <w:ind w:left="360"/>
+      </w:pPr>
+      <w:r>
+        <w:t>No standard method for FE analysis, optimal methods locked behind paywalls.</w:t>
+      </w:r>
+    </w:p>
+    <w:p>
+      <w:pPr>
+        <w:ind w:left="360"/>
+      </w:pPr>
+      <w:r>
+        <w:t>Methods to perform FE analysis: indirect vs direct vs canonical pathways</w:t>
+      </w:r>
+    </w:p>
+    <w:p>
+      <w:pPr>
+        <w:ind w:left="360"/>
+      </w:pPr>
+    </w:p>
+    <w:p>
+      <w:pPr>
+        <w:ind w:left="360"/>
+      </w:pPr>
+      <w:r>
+        <w:rPr>
+          <w:u w:val="single"/>
+        </w:rPr>
+        <w:t xml:space="preserve">Paragraph </w:t>
+      </w:r>
+      <w:r>
+        <w:rPr>
+          <w:u w:val="single"/>
+        </w:rPr>
+        <w:t>5</w:t>
+      </w:r>
+    </w:p>
+    <w:p>
+      <w:pPr>
+        <w:ind w:left="360"/>
+        <w:rPr>
+          <w:b/>
+          <w:bCs/>
+        </w:rPr>
+      </w:pPr>
+      <w:r>
+        <w:rPr>
+          <w:b/>
+          <w:bCs/>
+        </w:rPr>
+        <w:lastRenderedPageBreak/>
+        <w:t>Hypothesis/research question and approach.</w:t>
+      </w:r>
+    </w:p>
+    <w:p>
+      <w:pPr>
+        <w:ind w:left="360"/>
+      </w:pPr>
+      <w:r>
+        <w:t xml:space="preserve">Test whether </w:t>
+      </w:r>
+      <w:r>
+        <w:t>EV cargo changes in response to Protease/HDM/Dog allergens</w:t>
+      </w:r>
+      <w:r>
+        <w:t xml:space="preserve"> in each cell type.</w:t>
+      </w:r>
+    </w:p>
+    <w:p>
+      <w:pPr>
+        <w:ind w:left="360"/>
+      </w:pPr>
+      <w:r>
+        <w:t>Pathway enrichment of DE miRNAs</w:t>
+      </w:r>
+      <w:r>
+        <w:t xml:space="preserve"> to investigate pathways i</w:t>
+      </w:r>
+      <w:r>
+        <w:rPr>
+          <w:rFonts w:ascii="Calibri" w:eastAsia="Times New Roman" w:hAnsi="Calibri" w:cs="Calibri"/>
+          <w:color w:val="000000"/>
+          <w:lang w:eastAsia="en-GB"/>
+        </w:rPr>
+        <w:t>nvolved in airway immune signalling and allergic sensitisation.</w:t>
+      </w:r>
+    </w:p>
+    <w:p>
+      <w:pPr>
+        <w:ind w:left="360"/>
+      </w:pPr>
+      <w:r>
+        <w:t>Include detail</w:t>
+      </w:r>
+      <w:r>
+        <w:t xml:space="preserve"> of methods </w:t>
+      </w:r>
+      <w:r>
+        <w:t>tested vs used: tested indirect, direct and canonical; used canonical</w:t>
+      </w:r>
+      <w:r>
+        <w:t xml:space="preserve"> (Qiagen IPA</w:t>
+      </w:r>
+      <w:r>
+        <w:t>.</w:t>
+      </w:r>
+    </w:p>
+    <w:p>
+      <w:pPr>
+        <w:ind w:left="360"/>
+      </w:pPr>
+    </w:p>
+    <w:p>
+      <w:pPr>
+        <w:ind w:left="360"/>
+      </w:pPr>
     </w:p>
     <w:sectPr>
       <w:pgSz w:w="11906" w:h="16838"/>

</xml_diff>

<commit_message>
ADDING TODAY'S WORK - 24.06.2026
</commit_message>
<xml_diff>
--- a/write_up/drafts/2_introduction/introduction_plan.docx
+++ b/write_up/drafts/2_introduction/introduction_plan.docx
@@ -27,88 +27,46 @@
         </w:numPr>
       </w:pPr>
       <w:r>
-        <w:t>Intro to</w:t>
-      </w:r>
-      <w:r>
-        <w:t xml:space="preserve"> </w:t>
-      </w:r>
-      <w:proofErr w:type="spellStart"/>
-      <w:r>
-        <w:t>hbec</w:t>
-      </w:r>
-      <w:proofErr w:type="spellEnd"/>
-      <w:r>
-        <w:t>/</w:t>
-      </w:r>
-      <w:r>
-        <w:t>exosomes</w:t>
-      </w:r>
-    </w:p>
-    <w:p>
-      <w:pPr>
-        <w:pStyle w:val="ListParagraph"/>
+        <w:t>Tami results only provided after my execution of the analysis pipeline to maintain single blind conditions</w:t>
+      </w:r>
+    </w:p>
+    <w:p/>
+    <w:p>
+      <w:pPr>
+        <w:pStyle w:val="Title"/>
+        <w:rPr>
+          <w:u w:val="single"/>
+        </w:rPr>
+      </w:pPr>
+      <w:r>
+        <w:rPr>
+          <w:u w:val="single"/>
+        </w:rPr>
+        <w:t>Current</w:t>
+      </w:r>
+    </w:p>
+    <w:p>
+      <w:pPr>
+        <w:pStyle w:val="Subtitle"/>
         <w:numPr>
           <w:ilvl w:val="0"/>
-          <w:numId w:val="2"/>
-        </w:numPr>
-      </w:pPr>
-      <w:r>
-        <w:t xml:space="preserve">Intro to miRNAs </w:t>
-      </w:r>
-      <w:r>
-        <w:t>(incl. as regulators)</w:t>
-      </w:r>
-    </w:p>
-    <w:p>
-      <w:pPr>
-        <w:pStyle w:val="ListParagraph"/>
-        <w:numPr>
-          <w:ilvl w:val="0"/>
-          <w:numId w:val="2"/>
-        </w:numPr>
-      </w:pPr>
-      <w:r>
-        <w:t xml:space="preserve">Intro </w:t>
-      </w:r>
-      <w:r>
-        <w:t xml:space="preserve">to differential expression analysis for </w:t>
-      </w:r>
-      <w:proofErr w:type="spellStart"/>
-      <w:r>
-        <w:t>mirnas</w:t>
-      </w:r>
-      <w:proofErr w:type="spellEnd"/>
-    </w:p>
-    <w:p>
-      <w:pPr>
-        <w:pStyle w:val="ListParagraph"/>
-        <w:numPr>
-          <w:ilvl w:val="0"/>
-          <w:numId w:val="2"/>
-        </w:numPr>
-      </w:pPr>
-      <w:r>
-        <w:t xml:space="preserve">Intro to FE for </w:t>
-      </w:r>
-      <w:proofErr w:type="spellStart"/>
-      <w:r>
-        <w:t>mirnas</w:t>
-      </w:r>
-      <w:proofErr w:type="spellEnd"/>
-      <w:r>
-        <w:t xml:space="preserve"> (all the different methods)</w:t>
-      </w:r>
-    </w:p>
-    <w:p>
-      <w:pPr>
-        <w:pStyle w:val="ListParagraph"/>
-        <w:numPr>
-          <w:ilvl w:val="0"/>
-          <w:numId w:val="2"/>
-        </w:numPr>
-      </w:pPr>
-      <w:r>
-        <w:t>Tami results only provided after my execution of the analysis pipeline to maintain single blind conditions</w:t>
+          <w:numId w:val="0"/>
+        </w:numPr>
+      </w:pPr>
+      <w:r>
+        <w:t>Proposed plan</w:t>
+      </w:r>
+      <w:r>
+        <w:t>:</w:t>
+      </w:r>
+      <w:r>
+        <w:t xml:space="preserve"> 2</w:t>
+      </w:r>
+      <w:r>
+        <w:t>3</w:t>
+      </w:r>
+      <w:r>
+        <w:t>.06.2026 – Present</w:t>
       </w:r>
     </w:p>
     <w:p/>
@@ -148,13 +106,336 @@
     </w:p>
     <w:p>
       <w:pPr>
-        <w:ind w:left="360"/>
-      </w:pPr>
-      <w:r>
-        <w:t>Allergen effect on EVs and the epithelial barrier.</w:t>
-      </w:r>
-      <w:r>
-        <w:t xml:space="preserve"> [LF stated to cover this topic]</w:t>
+        <w:pStyle w:val="ListParagraph"/>
+        <w:numPr>
+          <w:ilvl w:val="0"/>
+          <w:numId w:val="3"/>
+        </w:numPr>
+      </w:pPr>
+      <w:r>
+        <w:t>Burden of allergic airway diseases.</w:t>
+      </w:r>
+    </w:p>
+    <w:p>
+      <w:pPr>
+        <w:pStyle w:val="ListParagraph"/>
+        <w:numPr>
+          <w:ilvl w:val="1"/>
+          <w:numId w:val="3"/>
+        </w:numPr>
+      </w:pPr>
+      <w:hyperlink r:id="rId5" w:history="1">
+        <w:r>
+          <w:rPr>
+            <w:rStyle w:val="Hyperlink"/>
+          </w:rPr>
+          <w:t>https://pmc.ncbi.nlm.nih.gov/articles/P</w:t>
+        </w:r>
+        <w:r>
+          <w:rPr>
+            <w:rStyle w:val="Hyperlink"/>
+          </w:rPr>
+          <w:t>M</w:t>
+        </w:r>
+        <w:r>
+          <w:rPr>
+            <w:rStyle w:val="Hyperlink"/>
+          </w:rPr>
+          <w:t>C7118214/#S2</w:t>
+        </w:r>
+      </w:hyperlink>
+    </w:p>
+    <w:p>
+      <w:pPr>
+        <w:pStyle w:val="ListParagraph"/>
+        <w:numPr>
+          <w:ilvl w:val="2"/>
+          <w:numId w:val="3"/>
+        </w:numPr>
+        <w:rPr>
+          <w:rFonts w:ascii="Aptos" w:hAnsi="Aptos"/>
+        </w:rPr>
+      </w:pPr>
+      <w:r>
+        <w:rPr>
+          <w:rFonts w:ascii="Aptos" w:hAnsi="Aptos"/>
+        </w:rPr>
+        <w:t>“</w:t>
+      </w:r>
+      <w:r>
+        <w:rPr>
+          <w:rFonts w:ascii="Aptos" w:hAnsi="Aptos"/>
+        </w:rPr>
+        <w:t>AR and asthma affect over 300 million people worldwide, thus being major public health problems</w:t>
+      </w:r>
+      <w:r>
+        <w:rPr>
+          <w:rFonts w:ascii="Aptos" w:hAnsi="Aptos"/>
+        </w:rPr>
+        <w:t>”</w:t>
+      </w:r>
+      <w:r>
+        <w:rPr>
+          <w:rFonts w:ascii="Aptos" w:hAnsi="Aptos"/>
+        </w:rPr>
+        <w:t xml:space="preserve">. Note: this is an old (2016 </w:t>
+      </w:r>
+      <w:proofErr w:type="spellStart"/>
+      <w:r>
+        <w:rPr>
+          <w:rFonts w:ascii="Aptos" w:hAnsi="Aptos"/>
+        </w:rPr>
+        <w:t>ish</w:t>
+      </w:r>
+      <w:proofErr w:type="spellEnd"/>
+      <w:r>
+        <w:rPr>
+          <w:rFonts w:ascii="Aptos" w:hAnsi="Aptos"/>
+        </w:rPr>
+        <w:t>) statistic</w:t>
+      </w:r>
+    </w:p>
+    <w:p>
+      <w:pPr>
+        <w:pStyle w:val="ListParagraph"/>
+        <w:numPr>
+          <w:ilvl w:val="1"/>
+          <w:numId w:val="3"/>
+        </w:numPr>
+      </w:pPr>
+      <w:hyperlink r:id="rId6" w:history="1">
+        <w:r>
+          <w:rPr>
+            <w:rStyle w:val="Hyperlink"/>
+          </w:rPr>
+          <w:t>https://pmc.ncbi.nlm.nih.gov/articles/PMC</w:t>
+        </w:r>
+        <w:r>
+          <w:rPr>
+            <w:rStyle w:val="Hyperlink"/>
+          </w:rPr>
+          <w:t>1</w:t>
+        </w:r>
+        <w:r>
+          <w:rPr>
+            <w:rStyle w:val="Hyperlink"/>
+          </w:rPr>
+          <w:t>1993038</w:t>
+        </w:r>
+        <w:r>
+          <w:rPr>
+            <w:rStyle w:val="Hyperlink"/>
+          </w:rPr>
+          <w:t>/</w:t>
+        </w:r>
+      </w:hyperlink>
+    </w:p>
+    <w:p>
+      <w:pPr>
+        <w:pStyle w:val="ListParagraph"/>
+        <w:numPr>
+          <w:ilvl w:val="2"/>
+          <w:numId w:val="3"/>
+        </w:numPr>
+      </w:pPr>
+      <w:r>
+        <w:t>“</w:t>
+      </w:r>
+      <w:r>
+        <w:t>In 2021, the prevalent cases of asthma remained alarmingly high at 260.48 million (95</w:t>
+      </w:r>
+      <w:r>
+        <w:rPr>
+          <w:rFonts w:ascii="Arial" w:hAnsi="Arial" w:cs="Arial"/>
+        </w:rPr>
+        <w:t> </w:t>
+      </w:r>
+      <w:r>
+        <w:t>% UI: 227.21 million to 297.97 million).</w:t>
+      </w:r>
+      <w:r>
+        <w:t>”</w:t>
+      </w:r>
+    </w:p>
+    <w:p>
+      <w:pPr>
+        <w:pStyle w:val="ListParagraph"/>
+        <w:numPr>
+          <w:ilvl w:val="0"/>
+          <w:numId w:val="3"/>
+        </w:numPr>
+      </w:pPr>
+      <w:r>
+        <w:t>Epithelial barrier as defence mechanism against inhaled allergens.</w:t>
+      </w:r>
+    </w:p>
+    <w:p>
+      <w:pPr>
+        <w:pStyle w:val="ListParagraph"/>
+        <w:numPr>
+          <w:ilvl w:val="1"/>
+          <w:numId w:val="3"/>
+        </w:numPr>
+      </w:pPr>
+      <w:hyperlink r:id="rId7" w:history="1">
+        <w:r>
+          <w:rPr>
+            <w:rStyle w:val="Hyperlink"/>
+          </w:rPr>
+          <w:t>https://pmc.ncbi.nlm.nih.gov/articles/</w:t>
+        </w:r>
+        <w:r>
+          <w:rPr>
+            <w:rStyle w:val="Hyperlink"/>
+          </w:rPr>
+          <w:t>P</w:t>
+        </w:r>
+        <w:r>
+          <w:rPr>
+            <w:rStyle w:val="Hyperlink"/>
+          </w:rPr>
+          <w:t>MC</w:t>
+        </w:r>
+        <w:r>
+          <w:rPr>
+            <w:rStyle w:val="Hyperlink"/>
+          </w:rPr>
+          <w:t>7</w:t>
+        </w:r>
+        <w:r>
+          <w:rPr>
+            <w:rStyle w:val="Hyperlink"/>
+          </w:rPr>
+          <w:t>118214/#S2</w:t>
+        </w:r>
+      </w:hyperlink>
+      <w:r>
+        <w:t xml:space="preserve"> </w:t>
+      </w:r>
+    </w:p>
+    <w:p>
+      <w:pPr>
+        <w:pStyle w:val="ListParagraph"/>
+        <w:numPr>
+          <w:ilvl w:val="2"/>
+          <w:numId w:val="3"/>
+        </w:numPr>
+      </w:pPr>
+      <w:r>
+        <w:t>“I</w:t>
+      </w:r>
+      <w:r>
+        <w:t>n healthy individuals, the airway barrier limits the entry of pathogens and allergens, regulates the interaction with the host immune system promoting homeostasis.</w:t>
+      </w:r>
+      <w:r>
+        <w:t>”</w:t>
+      </w:r>
+    </w:p>
+    <w:p>
+      <w:pPr>
+        <w:pStyle w:val="ListParagraph"/>
+        <w:numPr>
+          <w:ilvl w:val="2"/>
+          <w:numId w:val="3"/>
+        </w:numPr>
+      </w:pPr>
+      <w:r>
+        <w:t>“</w:t>
+      </w:r>
+      <w:r>
+        <w:t>Epithelial physical barriers are maintained by intercellular junctions. Tight junctions (TJ) are located the most apically, are linked to the cytoskeleton and inhibit solute and water movement through the paracellular space, thus establishing cell polarity</w:t>
+      </w:r>
+      <w:r>
+        <w:t>”</w:t>
+      </w:r>
+    </w:p>
+    <w:p>
+      <w:pPr>
+        <w:pStyle w:val="ListParagraph"/>
+        <w:numPr>
+          <w:ilvl w:val="2"/>
+          <w:numId w:val="3"/>
+        </w:numPr>
+      </w:pPr>
+      <w:r>
+        <w:t>“</w:t>
+      </w:r>
+      <w:r>
+        <w:t>Genetics and environmental factors can, during development, significantly modulate barrier homeostasis, influencing the predilection toward chronic airway inflammation.</w:t>
+      </w:r>
+      <w:r>
+        <w:t>”</w:t>
+      </w:r>
+    </w:p>
+    <w:p>
+      <w:pPr>
+        <w:pStyle w:val="ListParagraph"/>
+        <w:numPr>
+          <w:ilvl w:val="0"/>
+          <w:numId w:val="3"/>
+        </w:numPr>
+      </w:pPr>
+      <w:r>
+        <w:t>Causal factors: environment and genetic.</w:t>
+      </w:r>
+    </w:p>
+    <w:p>
+      <w:pPr>
+        <w:pStyle w:val="ListParagraph"/>
+        <w:numPr>
+          <w:ilvl w:val="1"/>
+          <w:numId w:val="3"/>
+        </w:numPr>
+      </w:pPr>
+      <w:hyperlink r:id="rId8" w:history="1">
+        <w:r>
+          <w:rPr>
+            <w:rStyle w:val="Hyperlink"/>
+          </w:rPr>
+          <w:t>https://www.sciencedirect.com/science/article/pii/S0091674919307535?via%3Dihub</w:t>
+        </w:r>
+      </w:hyperlink>
+    </w:p>
+    <w:p>
+      <w:pPr>
+        <w:pStyle w:val="ListParagraph"/>
+        <w:numPr>
+          <w:ilvl w:val="1"/>
+          <w:numId w:val="3"/>
+        </w:numPr>
+      </w:pPr>
+    </w:p>
+    <w:p>
+      <w:pPr>
+        <w:pStyle w:val="ListParagraph"/>
+        <w:numPr>
+          <w:ilvl w:val="0"/>
+          <w:numId w:val="3"/>
+        </w:numPr>
+      </w:pPr>
+      <w:r>
+        <w:t>EVs becoming known to regulate the epithelial barrier.</w:t>
+      </w:r>
+    </w:p>
+    <w:p>
+      <w:pPr>
+        <w:pStyle w:val="ListParagraph"/>
+        <w:numPr>
+          <w:ilvl w:val="1"/>
+          <w:numId w:val="3"/>
+        </w:numPr>
+      </w:pPr>
+    </w:p>
+    <w:p>
+      <w:pPr>
+        <w:pStyle w:val="ListParagraph"/>
+        <w:numPr>
+          <w:ilvl w:val="0"/>
+          <w:numId w:val="3"/>
+        </w:numPr>
+      </w:pPr>
+      <w:r>
+        <w:t>Why EV signalling is important.</w:t>
       </w:r>
     </w:p>
     <w:p>
@@ -200,6 +481,9 @@
         <w:ind w:left="360"/>
       </w:pPr>
       <w:r>
+        <w:t xml:space="preserve">Mechanism: </w:t>
+      </w:r>
+      <w:r>
         <w:t xml:space="preserve">HBECs </w:t>
       </w:r>
       <w:r>
@@ -223,17 +507,575 @@
     </w:p>
     <w:p>
       <w:pPr>
-        <w:ind w:left="360"/>
-      </w:pPr>
-      <w:r>
-        <w:t xml:space="preserve">Effect of </w:t>
-      </w:r>
-      <w:r>
-        <w:t>Protease/HDM/Dog allergens</w:t>
-      </w:r>
-      <w:r>
-        <w:t xml:space="preserve"> on HBECs.</w:t>
-      </w:r>
+        <w:pStyle w:val="ListParagraph"/>
+        <w:numPr>
+          <w:ilvl w:val="0"/>
+          <w:numId w:val="4"/>
+        </w:numPr>
+      </w:pPr>
+      <w:r>
+        <w:t>EV biogenesis from HBECs</w:t>
+      </w:r>
+    </w:p>
+    <w:p>
+      <w:pPr>
+        <w:pStyle w:val="ListParagraph"/>
+        <w:numPr>
+          <w:ilvl w:val="1"/>
+          <w:numId w:val="4"/>
+        </w:numPr>
+      </w:pPr>
+      <w:hyperlink r:id="rId9" w:history="1">
+        <w:r>
+          <w:rPr>
+            <w:rStyle w:val="Hyperlink"/>
+          </w:rPr>
+          <w:t>https://pmc.ncbi.nlm.nih.gov/articles/PMC11238361/</w:t>
+        </w:r>
+      </w:hyperlink>
+    </w:p>
+    <w:p>
+      <w:pPr>
+        <w:pStyle w:val="ListParagraph"/>
+        <w:numPr>
+          <w:ilvl w:val="2"/>
+          <w:numId w:val="4"/>
+        </w:numPr>
+      </w:pPr>
+      <w:r>
+        <w:t xml:space="preserve">Exosomes are classified as small (30–150 nm), phospholipid bilayer extracellular vehicles released by both prokaryotic and eukaryotic cells for intercellular communication and </w:t>
+      </w:r>
+      <w:proofErr w:type="spellStart"/>
+      <w:r>
+        <w:t>signaling</w:t>
+      </w:r>
+      <w:proofErr w:type="spellEnd"/>
+    </w:p>
+    <w:p>
+      <w:pPr>
+        <w:pStyle w:val="ListParagraph"/>
+        <w:numPr>
+          <w:ilvl w:val="2"/>
+          <w:numId w:val="4"/>
+        </w:numPr>
+      </w:pPr>
+      <w:r>
+        <w:t>“</w:t>
+      </w:r>
+      <w:proofErr w:type="gramStart"/>
+      <w:r>
+        <w:t>exosomes</w:t>
+      </w:r>
+      <w:proofErr w:type="gramEnd"/>
+      <w:r>
+        <w:t xml:space="preserve"> are important molecular mediators for cellular communication for transporting proteins, metabolites, and various nucleic acids throughout the body</w:t>
+      </w:r>
+      <w:r>
+        <w:t>”</w:t>
+      </w:r>
+    </w:p>
+    <w:p>
+      <w:pPr>
+        <w:pStyle w:val="ListParagraph"/>
+        <w:numPr>
+          <w:ilvl w:val="1"/>
+          <w:numId w:val="4"/>
+        </w:numPr>
+      </w:pPr>
+      <w:hyperlink r:id="rId10" w:history="1">
+        <w:r>
+          <w:rPr>
+            <w:rStyle w:val="Hyperlink"/>
+          </w:rPr>
+          <w:t>https://www.md</w:t>
+        </w:r>
+        <w:r>
+          <w:rPr>
+            <w:rStyle w:val="Hyperlink"/>
+          </w:rPr>
+          <w:t>p</w:t>
+        </w:r>
+        <w:r>
+          <w:rPr>
+            <w:rStyle w:val="Hyperlink"/>
+          </w:rPr>
+          <w:t>i.com/2076-3417/11/21/9933</w:t>
+        </w:r>
+      </w:hyperlink>
+    </w:p>
+    <w:p>
+      <w:pPr>
+        <w:pStyle w:val="ListParagraph"/>
+        <w:numPr>
+          <w:ilvl w:val="2"/>
+          <w:numId w:val="4"/>
+        </w:numPr>
+      </w:pPr>
+      <w:r>
+        <w:t>“</w:t>
+      </w:r>
+      <w:r>
+        <w:t>The major producer of EVs within the lung are airway epithelial cells</w:t>
+      </w:r>
+      <w:r>
+        <w:t>”</w:t>
+      </w:r>
+    </w:p>
+    <w:p>
+      <w:pPr>
+        <w:pStyle w:val="ListParagraph"/>
+        <w:numPr>
+          <w:ilvl w:val="1"/>
+          <w:numId w:val="4"/>
+        </w:numPr>
+      </w:pPr>
+      <w:r>
+        <w:t>https://isevjournals.onlinelibrary.wiley.com/doi/10.1002/jev2.12124</w:t>
+      </w:r>
+      <w:r>
+        <w:t xml:space="preserve"> </w:t>
+      </w:r>
+    </w:p>
+    <w:p>
+      <w:pPr>
+        <w:pStyle w:val="ListParagraph"/>
+        <w:numPr>
+          <w:ilvl w:val="2"/>
+          <w:numId w:val="4"/>
+        </w:numPr>
+      </w:pPr>
+      <w:r>
+        <w:t>“</w:t>
+      </w:r>
+      <w:r>
+        <w:t xml:space="preserve">EVs are double-layered lipid membrane vesicles that are categorized as exosomes, </w:t>
+      </w:r>
+      <w:proofErr w:type="spellStart"/>
+      <w:r>
+        <w:t>microvesicles</w:t>
+      </w:r>
+      <w:proofErr w:type="spellEnd"/>
+      <w:r>
+        <w:t>, and apoptotic bodies, based on their size, biogenesis and secretory mechanisms (Fujita et al., 2015).</w:t>
+      </w:r>
+      <w:r>
+        <w:t>”</w:t>
+      </w:r>
+    </w:p>
+    <w:p>
+      <w:pPr>
+        <w:pStyle w:val="ListParagraph"/>
+        <w:numPr>
+          <w:ilvl w:val="2"/>
+          <w:numId w:val="4"/>
+        </w:numPr>
+        <w:rPr>
+          <w:rFonts w:ascii="Aptos" w:hAnsi="Aptos"/>
+        </w:rPr>
+      </w:pPr>
+      <w:r>
+        <w:rPr>
+          <w:rFonts w:ascii="Aptos" w:hAnsi="Aptos" w:cs="Open Sans"/>
+          <w:color w:val="000000"/>
+          <w:shd w:val="clear" w:color="auto" w:fill="FFFFFF"/>
+        </w:rPr>
+        <w:t>“</w:t>
+      </w:r>
+      <w:r>
+        <w:rPr>
+          <w:rFonts w:ascii="Aptos" w:hAnsi="Aptos" w:cs="Open Sans"/>
+          <w:color w:val="000000"/>
+          <w:shd w:val="clear" w:color="auto" w:fill="FFFFFF"/>
+        </w:rPr>
+        <w:t>EVs are important mediators of intercellular communication via the transfer of their bioactive cargo molecules such as microRNAs (miRNAs) and proteins (Kosaka et al., </w:t>
+      </w:r>
+      <w:hyperlink r:id="rId11" w:anchor="jev212124-bib-0024" w:history="1">
+        <w:r>
+          <w:rPr>
+            <w:rStyle w:val="Hyperlink"/>
+            <w:rFonts w:ascii="Aptos" w:hAnsi="Aptos" w:cs="Open Sans"/>
+            <w:b/>
+            <w:bCs/>
+            <w:color w:val="0056B3"/>
+          </w:rPr>
+          <w:t>2010</w:t>
+        </w:r>
+      </w:hyperlink>
+      <w:r>
+        <w:rPr>
+          <w:rFonts w:ascii="Aptos" w:hAnsi="Aptos" w:cs="Open Sans"/>
+          <w:color w:val="000000"/>
+          <w:shd w:val="clear" w:color="auto" w:fill="FFFFFF"/>
+        </w:rPr>
+        <w:t>). </w:t>
+      </w:r>
+      <w:r>
+        <w:rPr>
+          <w:rFonts w:ascii="Aptos" w:hAnsi="Aptos" w:cs="Open Sans"/>
+          <w:color w:val="000000"/>
+          <w:shd w:val="clear" w:color="auto" w:fill="FFFFFF"/>
+        </w:rPr>
+        <w:t>“</w:t>
+      </w:r>
+    </w:p>
+    <w:p>
+      <w:pPr>
+        <w:pStyle w:val="ListParagraph"/>
+        <w:numPr>
+          <w:ilvl w:val="1"/>
+          <w:numId w:val="4"/>
+        </w:numPr>
+      </w:pPr>
+      <w:hyperlink r:id="rId12" w:history="1">
+        <w:r>
+          <w:rPr>
+            <w:rStyle w:val="Hyperlink"/>
+          </w:rPr>
+          <w:t>https://www.nature.com/articles/s42003-024-06197-3</w:t>
+        </w:r>
+      </w:hyperlink>
+    </w:p>
+    <w:p>
+      <w:pPr>
+        <w:pStyle w:val="ListParagraph"/>
+        <w:numPr>
+          <w:ilvl w:val="2"/>
+          <w:numId w:val="4"/>
+        </w:numPr>
+      </w:pPr>
+      <w:r>
+        <w:t>“</w:t>
+      </w:r>
+      <w:r>
+        <w:t>EVs are lipid bilayer-enclosed particles released by all cell types, both in normal and disease conditions10.</w:t>
+      </w:r>
+      <w:r>
+        <w:t>”</w:t>
+      </w:r>
+    </w:p>
+    <w:p>
+      <w:pPr>
+        <w:pStyle w:val="ListParagraph"/>
+        <w:numPr>
+          <w:ilvl w:val="2"/>
+          <w:numId w:val="4"/>
+        </w:numPr>
+      </w:pPr>
+      <w:r>
+        <w:t>“</w:t>
+      </w:r>
+      <w:r>
+        <w:t>These vesicles serve as carriers of proteins, mRNAs, microRNAs (miRNAs), and lipids from their parent cells, thereby inducing signal transduction in recipient cells</w:t>
+      </w:r>
+      <w:r>
+        <w:t>”</w:t>
+      </w:r>
+    </w:p>
+    <w:p>
+      <w:pPr>
+        <w:pStyle w:val="ListParagraph"/>
+        <w:numPr>
+          <w:ilvl w:val="2"/>
+          <w:numId w:val="4"/>
+        </w:numPr>
+      </w:pPr>
+      <w:r>
+        <w:t>“</w:t>
+      </w:r>
+      <w:r>
+        <w:t>Moreover, whether secreted by lung or non-lung cells, EVs have been found to play a crucial role in regulating both physiological and pathological activities within pulmonary tissues by facilitating alveolar cell crosstalk events in the lung microenvironment11.</w:t>
+      </w:r>
+      <w:r>
+        <w:t>”</w:t>
+      </w:r>
+    </w:p>
+    <w:p>
+      <w:pPr>
+        <w:pStyle w:val="ListParagraph"/>
+        <w:numPr>
+          <w:ilvl w:val="0"/>
+          <w:numId w:val="4"/>
+        </w:numPr>
+      </w:pPr>
+      <w:r>
+        <w:t>miRNA regulation via EVs</w:t>
+      </w:r>
+    </w:p>
+    <w:p>
+      <w:pPr>
+        <w:pStyle w:val="ListParagraph"/>
+        <w:numPr>
+          <w:ilvl w:val="1"/>
+          <w:numId w:val="4"/>
+        </w:numPr>
+      </w:pPr>
+      <w:hyperlink r:id="rId13" w:history="1">
+        <w:r>
+          <w:rPr>
+            <w:rStyle w:val="Hyperlink"/>
+          </w:rPr>
+          <w:t>https://www.nature.com/artic</w:t>
+        </w:r>
+        <w:r>
+          <w:rPr>
+            <w:rStyle w:val="Hyperlink"/>
+          </w:rPr>
+          <w:t>l</w:t>
+        </w:r>
+        <w:r>
+          <w:rPr>
+            <w:rStyle w:val="Hyperlink"/>
+          </w:rPr>
+          <w:t>es/s12276-020-0450-9</w:t>
+        </w:r>
+      </w:hyperlink>
+    </w:p>
+    <w:p>
+      <w:pPr>
+        <w:pStyle w:val="ListParagraph"/>
+        <w:numPr>
+          <w:ilvl w:val="2"/>
+          <w:numId w:val="4"/>
+        </w:numPr>
+      </w:pPr>
+      <w:r>
+        <w:lastRenderedPageBreak/>
+        <w:t>“</w:t>
+      </w:r>
+      <w:r>
+        <w:t>Recent studies have shown that EVs are primarily generated by lung epithelial cells during lung inflammation9,21,24,27. These lung epithelial EVs, composed mainly of miRNA-containing MVs, carry inflammatory signals that primarily target alveolar macrophages (AMs).</w:t>
+      </w:r>
+      <w:r>
+        <w:t>”</w:t>
+      </w:r>
+    </w:p>
+    <w:p>
+      <w:pPr>
+        <w:pStyle w:val="ListParagraph"/>
+        <w:numPr>
+          <w:ilvl w:val="2"/>
+          <w:numId w:val="4"/>
+        </w:numPr>
+      </w:pPr>
+      <w:r>
+        <w:t>“</w:t>
+      </w:r>
+      <w:r>
+        <w:t>Notably, they secrete EV-miRNAs containing different profiles of miRNAs that significantly alter the local tissue environment and activate the innate immune responses by transferring functional miRNAs to the target recipient cells</w:t>
+      </w:r>
+      <w:r>
+        <w:t>”</w:t>
+      </w:r>
+    </w:p>
+    <w:p>
+      <w:pPr>
+        <w:pStyle w:val="ListParagraph"/>
+        <w:numPr>
+          <w:ilvl w:val="0"/>
+          <w:numId w:val="4"/>
+        </w:numPr>
+      </w:pPr>
+      <w:r>
+        <w:t xml:space="preserve">Evidence of HBEC EV miRNA on </w:t>
+      </w:r>
+      <w:r>
+        <w:t>homeostasis</w:t>
+      </w:r>
+    </w:p>
+    <w:p>
+      <w:pPr>
+        <w:pStyle w:val="ListParagraph"/>
+        <w:numPr>
+          <w:ilvl w:val="0"/>
+          <w:numId w:val="4"/>
+        </w:numPr>
+      </w:pPr>
+      <w:r>
+        <w:t xml:space="preserve">Evidence of HBEC EV miRNA </w:t>
+      </w:r>
+      <w:r>
+        <w:t>in</w:t>
+      </w:r>
+      <w:r>
+        <w:t xml:space="preserve"> </w:t>
+      </w:r>
+      <w:r>
+        <w:t>pathological diseases</w:t>
+      </w:r>
+    </w:p>
+    <w:p>
+      <w:pPr>
+        <w:pStyle w:val="ListParagraph"/>
+        <w:numPr>
+          <w:ilvl w:val="1"/>
+          <w:numId w:val="4"/>
+        </w:numPr>
+      </w:pPr>
+      <w:hyperlink r:id="rId14" w:history="1">
+        <w:r>
+          <w:rPr>
+            <w:rStyle w:val="Hyperlink"/>
+          </w:rPr>
+          <w:t>https://pmc.ncbi.nlm.nih.gov/articles/PMC5770401/</w:t>
+        </w:r>
+      </w:hyperlink>
+    </w:p>
+    <w:p>
+      <w:pPr>
+        <w:pStyle w:val="ListParagraph"/>
+        <w:numPr>
+          <w:ilvl w:val="2"/>
+          <w:numId w:val="4"/>
+        </w:numPr>
+      </w:pPr>
+      <w:r>
+        <w:t>“…</w:t>
+      </w:r>
+      <w:r>
+        <w:t>imbalance of proteases and protease inhibitors in the epithelial barrier leads to both the initiation and maintenance of chronic eosinophilic airway inflammation.</w:t>
+      </w:r>
+      <w:r>
+        <w:t>”</w:t>
+      </w:r>
+    </w:p>
+    <w:p>
+      <w:pPr>
+        <w:pStyle w:val="ListParagraph"/>
+        <w:numPr>
+          <w:ilvl w:val="1"/>
+          <w:numId w:val="4"/>
+        </w:numPr>
+      </w:pPr>
+      <w:hyperlink r:id="rId15" w:history="1">
+        <w:r>
+          <w:rPr>
+            <w:rStyle w:val="Hyperlink"/>
+          </w:rPr>
+          <w:t>https://www.mdpi.com/2076-3417/11/21/9933</w:t>
+        </w:r>
+      </w:hyperlink>
+    </w:p>
+    <w:p>
+      <w:pPr>
+        <w:pStyle w:val="ListParagraph"/>
+        <w:numPr>
+          <w:ilvl w:val="2"/>
+          <w:numId w:val="4"/>
+        </w:numPr>
+      </w:pPr>
+      <w:r>
+        <w:t>“</w:t>
+      </w:r>
+      <w:r>
+        <w:t>Asthma is caused by both environmental factors such as house dust mites (HDM)</w:t>
+      </w:r>
+      <w:r>
+        <w:t>”</w:t>
+      </w:r>
+    </w:p>
+    <w:p>
+      <w:pPr>
+        <w:pStyle w:val="ListParagraph"/>
+        <w:numPr>
+          <w:ilvl w:val="1"/>
+          <w:numId w:val="4"/>
+        </w:numPr>
+      </w:pPr>
+      <w:hyperlink r:id="rId16" w:history="1">
+        <w:r>
+          <w:rPr>
+            <w:rStyle w:val="Hyperlink"/>
+            <w:rFonts w:ascii="Aptos" w:hAnsi="Aptos"/>
+          </w:rPr>
+          <w:t>https://p</w:t>
+        </w:r>
+        <w:r>
+          <w:rPr>
+            <w:rStyle w:val="Hyperlink"/>
+            <w:rFonts w:ascii="Aptos" w:hAnsi="Aptos"/>
+          </w:rPr>
+          <w:t>m</w:t>
+        </w:r>
+        <w:r>
+          <w:rPr>
+            <w:rStyle w:val="Hyperlink"/>
+            <w:rFonts w:ascii="Aptos" w:hAnsi="Aptos"/>
+          </w:rPr>
+          <w:t>c.ncbi.nlm.nih.gov/articles/PMC7118214/</w:t>
+        </w:r>
+      </w:hyperlink>
+    </w:p>
+    <w:p>
+      <w:pPr>
+        <w:pStyle w:val="ListParagraph"/>
+        <w:numPr>
+          <w:ilvl w:val="2"/>
+          <w:numId w:val="4"/>
+        </w:numPr>
+      </w:pPr>
+      <w:r>
+        <w:t>“</w:t>
+      </w:r>
+      <w:r>
+        <w:rPr>
+          <w:rFonts w:ascii="Aptos" w:hAnsi="Aptos"/>
+        </w:rPr>
+        <w:t>In particular miR-34a, miR-92b, and miR-210 may have a role in the development of the Th 2 response in asthma</w:t>
+      </w:r>
+      <w:r>
+        <w:rPr>
+          <w:rFonts w:ascii="Aptos" w:hAnsi="Aptos"/>
+        </w:rPr>
+        <w:t>”</w:t>
+      </w:r>
+    </w:p>
+    <w:p>
+      <w:pPr>
+        <w:pStyle w:val="ListParagraph"/>
+        <w:numPr>
+          <w:ilvl w:val="1"/>
+          <w:numId w:val="4"/>
+        </w:numPr>
+      </w:pPr>
+      <w:hyperlink r:id="rId17" w:history="1">
+        <w:r>
+          <w:rPr>
+            <w:rStyle w:val="Hyperlink"/>
+          </w:rPr>
+          <w:t>https://pubmed.ncbi.nlm.nih.gov/23333113/</w:t>
+        </w:r>
+      </w:hyperlink>
+    </w:p>
+    <w:p>
+      <w:pPr>
+        <w:pStyle w:val="ListParagraph"/>
+        <w:numPr>
+          <w:ilvl w:val="2"/>
+          <w:numId w:val="4"/>
+        </w:numPr>
+      </w:pPr>
+      <w:r>
+        <w:t>“</w:t>
+      </w:r>
+      <w:r>
+        <w:t xml:space="preserve">These studies demonstrate substantial differences in </w:t>
+      </w:r>
+      <w:proofErr w:type="spellStart"/>
+      <w:r>
+        <w:t>exosomal</w:t>
+      </w:r>
+      <w:proofErr w:type="spellEnd"/>
+      <w:r>
+        <w:t xml:space="preserve"> miRNA profiles between healthy subjects and patients with unprovoked, mild, stable asthma</w:t>
+      </w:r>
+      <w:r>
+        <w:t>”</w:t>
+      </w:r>
+    </w:p>
+    <w:p>
+      <w:pPr>
+        <w:pStyle w:val="ListParagraph"/>
+      </w:pPr>
     </w:p>
     <w:p>
       <w:pPr>
@@ -282,21 +1124,258 @@
     </w:p>
     <w:p>
       <w:pPr>
-        <w:ind w:left="360"/>
-      </w:pPr>
-      <w:r>
-        <w:t>Cell type effect (primary HBEC vs Calu-3)</w:t>
-      </w:r>
-      <w:r>
-        <w:t>.</w:t>
-      </w:r>
-    </w:p>
-    <w:p>
-      <w:pPr>
-        <w:ind w:left="360"/>
-      </w:pPr>
-      <w:r>
-        <w:t>Anything that the company/Lucy wanted to find out.</w:t>
+        <w:pStyle w:val="ListParagraph"/>
+        <w:numPr>
+          <w:ilvl w:val="0"/>
+          <w:numId w:val="5"/>
+        </w:numPr>
+      </w:pPr>
+      <w:r>
+        <w:t>How miRNA cargo from HBECs (primary cells vs cell lines) changes in response to allergens</w:t>
+      </w:r>
+    </w:p>
+    <w:p>
+      <w:pPr>
+        <w:pStyle w:val="ListParagraph"/>
+        <w:numPr>
+          <w:ilvl w:val="1"/>
+          <w:numId w:val="5"/>
+        </w:numPr>
+      </w:pPr>
+      <w:hyperlink r:id="rId18" w:history="1">
+        <w:r>
+          <w:rPr>
+            <w:rStyle w:val="Hyperlink"/>
+          </w:rPr>
+          <w:t>https://onlinelibrary.wiley.com/doi/full/10.1111/cea.13016</w:t>
+        </w:r>
+      </w:hyperlink>
+    </w:p>
+    <w:p>
+      <w:pPr>
+        <w:pStyle w:val="ListParagraph"/>
+        <w:numPr>
+          <w:ilvl w:val="2"/>
+          <w:numId w:val="5"/>
+        </w:numPr>
+      </w:pPr>
+      <w:r>
+        <w:t xml:space="preserve">Effect of </w:t>
+      </w:r>
+      <w:proofErr w:type="spellStart"/>
+      <w:r>
+        <w:t>hdm</w:t>
+      </w:r>
+      <w:proofErr w:type="spellEnd"/>
+      <w:r>
+        <w:t xml:space="preserve"> in mice</w:t>
+      </w:r>
+    </w:p>
+    <w:p>
+      <w:pPr>
+        <w:pStyle w:val="ListParagraph"/>
+        <w:ind w:left="1800"/>
+      </w:pPr>
+    </w:p>
+    <w:p>
+      <w:pPr>
+        <w:pStyle w:val="ListParagraph"/>
+        <w:ind w:left="1800"/>
+      </w:pPr>
+    </w:p>
+    <w:p>
+      <w:pPr>
+        <w:pStyle w:val="ListParagraph"/>
+        <w:numPr>
+          <w:ilvl w:val="1"/>
+          <w:numId w:val="8"/>
+        </w:numPr>
+        <w:rPr>
+          <w:i/>
+          <w:iCs/>
+        </w:rPr>
+      </w:pPr>
+      <w:r>
+        <w:rPr>
+          <w:i/>
+          <w:iCs/>
+        </w:rPr>
+        <w:t>Effect of allergens on HBECs</w:t>
+      </w:r>
+      <w:r>
+        <w:rPr>
+          <w:i/>
+          <w:iCs/>
+        </w:rPr>
+        <w:t xml:space="preserve"> cultured using an air-liquid-interface culture model</w:t>
+      </w:r>
+      <w:r>
+        <w:rPr>
+          <w:i/>
+          <w:iCs/>
+        </w:rPr>
+        <w:t xml:space="preserve"> using nebuliser</w:t>
+      </w:r>
+    </w:p>
+    <w:p>
+      <w:pPr>
+        <w:pStyle w:val="ListParagraph"/>
+        <w:numPr>
+          <w:ilvl w:val="2"/>
+          <w:numId w:val="8"/>
+        </w:numPr>
+        <w:rPr>
+          <w:i/>
+          <w:iCs/>
+        </w:rPr>
+      </w:pPr>
+      <w:hyperlink r:id="rId19" w:history="1">
+        <w:r>
+          <w:rPr>
+            <w:rStyle w:val="Hyperlink"/>
+            <w:i/>
+            <w:iCs/>
+          </w:rPr>
+          <w:t>https://pmc.ncbi.nlm.nih.gov/articles/PMC12563611/</w:t>
+        </w:r>
+      </w:hyperlink>
+    </w:p>
+    <w:p>
+      <w:pPr>
+        <w:pStyle w:val="ListParagraph"/>
+        <w:numPr>
+          <w:ilvl w:val="3"/>
+          <w:numId w:val="8"/>
+        </w:numPr>
+        <w:rPr>
+          <w:i/>
+          <w:iCs/>
+        </w:rPr>
+      </w:pPr>
+      <w:r>
+        <w:rPr>
+          <w:i/>
+          <w:iCs/>
+        </w:rPr>
+        <w:t>They used a 3D printed nebuliser.</w:t>
+      </w:r>
+    </w:p>
+    <w:p>
+      <w:pPr>
+        <w:pStyle w:val="ListParagraph"/>
+        <w:numPr>
+          <w:ilvl w:val="1"/>
+          <w:numId w:val="8"/>
+        </w:numPr>
+        <w:rPr>
+          <w:i/>
+          <w:iCs/>
+        </w:rPr>
+      </w:pPr>
+      <w:r>
+        <w:rPr>
+          <w:i/>
+          <w:iCs/>
+        </w:rPr>
+        <w:lastRenderedPageBreak/>
+        <w:t>Calu-3 as a model would be more accessible (cheaper) than HBECs.</w:t>
+      </w:r>
+    </w:p>
+    <w:p>
+      <w:pPr>
+        <w:pStyle w:val="ListParagraph"/>
+        <w:numPr>
+          <w:ilvl w:val="1"/>
+          <w:numId w:val="8"/>
+        </w:numPr>
+        <w:rPr>
+          <w:i/>
+          <w:iCs/>
+        </w:rPr>
+      </w:pPr>
+      <w:r>
+        <w:rPr>
+          <w:i/>
+          <w:iCs/>
+        </w:rPr>
+        <w:t xml:space="preserve">Cell type effect </w:t>
+      </w:r>
+      <w:r>
+        <w:rPr>
+          <w:i/>
+          <w:iCs/>
+        </w:rPr>
+        <w:t xml:space="preserve">differences </w:t>
+      </w:r>
+      <w:r>
+        <w:rPr>
+          <w:i/>
+          <w:iCs/>
+        </w:rPr>
+        <w:t>(primary HBEC vs Calu-3).</w:t>
+      </w:r>
+    </w:p>
+    <w:p>
+      <w:pPr>
+        <w:pStyle w:val="ListParagraph"/>
+        <w:numPr>
+          <w:ilvl w:val="1"/>
+          <w:numId w:val="8"/>
+        </w:numPr>
+        <w:rPr>
+          <w:i/>
+          <w:iCs/>
+        </w:rPr>
+      </w:pPr>
+      <w:r>
+        <w:rPr>
+          <w:i/>
+          <w:iCs/>
+        </w:rPr>
+        <w:t>Commercial (</w:t>
+      </w:r>
+      <w:proofErr w:type="spellStart"/>
+      <w:r>
+        <w:rPr>
+          <w:i/>
+          <w:iCs/>
+        </w:rPr>
+        <w:t>unilever</w:t>
+      </w:r>
+      <w:proofErr w:type="spellEnd"/>
+      <w:r>
+        <w:rPr>
+          <w:i/>
+          <w:iCs/>
+        </w:rPr>
+        <w:t>) interests?</w:t>
+      </w:r>
+    </w:p>
+    <w:p>
+      <w:pPr>
+        <w:pStyle w:val="ListParagraph"/>
+        <w:numPr>
+          <w:ilvl w:val="2"/>
+          <w:numId w:val="8"/>
+        </w:numPr>
+        <w:rPr>
+          <w:i/>
+          <w:iCs/>
+        </w:rPr>
+      </w:pPr>
+      <w:r>
+        <w:rPr>
+          <w:i/>
+          <w:iCs/>
+        </w:rPr>
+        <w:t>Commercial companies are keen to minimise the allergic impact of their products</w:t>
+      </w:r>
+      <w:r>
+        <w:rPr>
+          <w:i/>
+          <w:iCs/>
+        </w:rPr>
+        <w:t>…</w:t>
       </w:r>
     </w:p>
     <w:p>
@@ -334,82 +1413,16 @@
           <w:b/>
           <w:bCs/>
         </w:rPr>
-        <w:t>Technical details</w:t>
-      </w:r>
-      <w:r>
-        <w:rPr>
-          <w:b/>
-          <w:bCs/>
-        </w:rPr>
-        <w:t>.</w:t>
-      </w:r>
-    </w:p>
-    <w:p>
-      <w:pPr>
-        <w:ind w:left="360"/>
-      </w:pPr>
-      <w:r>
-        <w:t>Methods to perform DE analysis.</w:t>
-      </w:r>
-    </w:p>
-    <w:p>
-      <w:pPr>
-        <w:ind w:left="360"/>
-      </w:pPr>
-      <w:r>
-        <w:t>No standard method for FE analysis, optimal methods locked behind paywalls.</w:t>
-      </w:r>
-    </w:p>
-    <w:p>
-      <w:pPr>
-        <w:ind w:left="360"/>
-      </w:pPr>
-      <w:r>
-        <w:t>Methods to perform FE analysis: indirect vs direct vs canonical pathways</w:t>
-      </w:r>
-    </w:p>
-    <w:p>
-      <w:pPr>
-        <w:ind w:left="360"/>
-      </w:pPr>
-    </w:p>
-    <w:p>
-      <w:pPr>
-        <w:ind w:left="360"/>
-      </w:pPr>
-      <w:r>
-        <w:rPr>
-          <w:u w:val="single"/>
-        </w:rPr>
-        <w:t xml:space="preserve">Paragraph </w:t>
-      </w:r>
-      <w:r>
-        <w:rPr>
-          <w:u w:val="single"/>
-        </w:rPr>
-        <w:t>5</w:t>
-      </w:r>
-    </w:p>
-    <w:p>
-      <w:pPr>
-        <w:ind w:left="360"/>
-        <w:rPr>
-          <w:b/>
-          <w:bCs/>
-        </w:rPr>
-      </w:pPr>
-      <w:r>
-        <w:rPr>
-          <w:b/>
-          <w:bCs/>
-        </w:rPr>
-        <w:lastRenderedPageBreak/>
         <w:t>Hypothesis/research question and approach.</w:t>
       </w:r>
     </w:p>
     <w:p>
       <w:pPr>
-        <w:ind w:left="360"/>
+        <w:pStyle w:val="ListParagraph"/>
+        <w:numPr>
+          <w:ilvl w:val="0"/>
+          <w:numId w:val="6"/>
+        </w:numPr>
       </w:pPr>
       <w:r>
         <w:t xml:space="preserve">Test whether </w:t>
@@ -423,7 +1436,11 @@
     </w:p>
     <w:p>
       <w:pPr>
-        <w:ind w:left="360"/>
+        <w:pStyle w:val="ListParagraph"/>
+        <w:numPr>
+          <w:ilvl w:val="0"/>
+          <w:numId w:val="6"/>
+        </w:numPr>
       </w:pPr>
       <w:r>
         <w:t>Pathway enrichment of DE miRNAs</w:t>
@@ -442,34 +1459,63 @@
     </w:p>
     <w:p>
       <w:pPr>
+        <w:pStyle w:val="ListParagraph"/>
+        <w:numPr>
+          <w:ilvl w:val="0"/>
+          <w:numId w:val="6"/>
+        </w:numPr>
+      </w:pPr>
+      <w:r>
+        <w:t>Include detail</w:t>
+      </w:r>
+      <w:r>
+        <w:t xml:space="preserve"> of methods </w:t>
+      </w:r>
+      <w:r>
+        <w:t>tested vs used: tested indirect, direct and canonical; used canonical</w:t>
+      </w:r>
+      <w:r>
+        <w:t xml:space="preserve"> (Qiagen IPA</w:t>
+      </w:r>
+      <w:r>
+        <w:t>)</w:t>
+      </w:r>
+      <w:r>
+        <w:t>.</w:t>
+      </w:r>
+    </w:p>
+    <w:p>
+      <w:pPr>
+        <w:pStyle w:val="ListParagraph"/>
+        <w:numPr>
+          <w:ilvl w:val="0"/>
+          <w:numId w:val="6"/>
+        </w:numPr>
+      </w:pPr>
+      <w:r>
+        <w:t>Tami results only provided after my execution of the analysis pipeline to maintain single blind conditions</w:t>
+      </w:r>
+    </w:p>
+    <w:p>
+      <w:pPr>
         <w:ind w:left="360"/>
       </w:pPr>
-      <w:r>
-        <w:t>Include detail</w:t>
-      </w:r>
-      <w:r>
-        <w:t xml:space="preserve"> of methods </w:t>
-      </w:r>
-      <w:r>
-        <w:t>tested vs used: tested indirect, direct and canonical; used canonical</w:t>
-      </w:r>
-      <w:r>
-        <w:t xml:space="preserve"> (Qiagen IPA</w:t>
-      </w:r>
-      <w:r>
-        <w:t>.</w:t>
-      </w:r>
-    </w:p>
-    <w:p>
-      <w:pPr>
-        <w:ind w:left="360"/>
-      </w:pPr>
-    </w:p>
-    <w:p>
-      <w:pPr>
-        <w:ind w:left="360"/>
-      </w:pPr>
-    </w:p>
+    </w:p>
+    <w:p>
+      <w:pPr>
+        <w:pStyle w:val="Title"/>
+        <w:rPr>
+          <w:u w:val="single"/>
+        </w:rPr>
+      </w:pPr>
+      <w:r>
+        <w:rPr>
+          <w:u w:val="single"/>
+        </w:rPr>
+        <w:t>Archive</w:t>
+      </w:r>
+    </w:p>
+    <w:p/>
     <w:sectPr>
       <w:pgSz w:w="11906" w:h="16838"/>
       <w:pgMar w:top="1440" w:right="1440" w:bottom="1440" w:left="1440" w:header="708" w:footer="708" w:gutter="0"/>
@@ -483,6 +1529,181 @@
 <file path=word/numbering.xml><?xml version="1.0" encoding="utf-8"?>
 <w:numbering xmlns:wpc="http://schemas.microsoft.com/office/word/2010/wordprocessingCanvas" xmlns:cx="http://schemas.microsoft.com/office/drawing/2014/chartex" xmlns:cx1="http://schemas.microsoft.com/office/drawing/2015/9/8/chartex" xmlns:cx2="http://schemas.microsoft.com/office/drawing/2015/10/21/chartex" xmlns:cx3="http://schemas.microsoft.com/office/drawing/2016/5/9/chartex" xmlns:cx4="http://schemas.microsoft.com/office/drawing/2016/5/10/chartex" xmlns:cx5="http://schemas.microsoft.com/office/drawing/2016/5/11/chartex" xmlns:cx6="http://schemas.microsoft.com/office/drawing/2016/5/12/chartex" xmlns:cx7="http://schemas.microsoft.com/office/drawing/2016/5/13/chartex" xmlns:cx8="http://schemas.microsoft.com/office/drawing/2016/5/14/chartex" xmlns:mc="http://schemas.openxmlformats.org/markup-compatibility/2006" xmlns:m="http://schemas.openxmlformats.org/officeDocument/2006/math" xmlns:aink="http://schemas.microsoft.com/office/drawing/2016/ink" xmlns:am3d="http://schemas.microsoft.com/office/drawing/2017/model3d" xmlns:oel="http://schemas.microsoft.com/office/2019/extlst" xmlns:r="http://schemas.openxmlformats.org/officeDocument/2006/relationships" xmlns:wp14="http://schemas.microsoft.com/office/word/2010/wordprocessingDrawing" xmlns:wp="http://schemas.openxmlformats.org/drawingml/2006/wordprocessingDrawing" xmlns:wpg="http://schemas.microsoft.com/office/word/2010/wordprocessingGroup" xmlns:wpi="http://schemas.microsoft.com/office/word/2010/wordprocessingInk" xmlns:wps="http://schemas.microsoft.com/office/word/2010/wordprocessingShape" xmlns:o="urn:schemas-microsoft-com:office:office" xmlns:v="urn:schemas-microsoft-com:vml" xmlns:w10="urn:schemas-microsoft-com:office:word" xmlns:w="http://schemas.openxmlformats.org/wordprocessingml/2006/main" xmlns:w14="http://schemas.microsoft.com/office/word/2010/wordml" xmlns:w15="http://schemas.microsoft.com/office/word/2012/wordml" xmlns:w16cex="http://schemas.microsoft.com/office/word/2018/wordml/cex" xmlns:w16cid="http://schemas.microsoft.com/office/word/2016/wordml/cid" xmlns:w16="http://schemas.microsoft.com/office/word/2018/wordml" xmlns:w16sdtdh="http://schemas.microsoft.com/office/word/2020/wordml/sdtdatahash" xmlns:w16sdtfl="http://schemas.microsoft.com/office/word/2024/wordml/sdtformatlock" xmlns:w16se="http://schemas.microsoft.com/office/word/2015/wordml/symex" xmlns:w16du="http://schemas.microsoft.com/office/word/2023/wordml/word16du" xmlns:wne="http://schemas.microsoft.com/office/word/2006/wordml" mc:Ignorable="w14 w15 w16se w16cid w16 w16cex w16sdtdh w16sdtfl w16du wp14">
   <w:abstractNum w:abstractNumId="0" w15:restartNumberingAfterBreak="0">
+    <w:nsid w:val="0350554E"/>
+    <w:multiLevelType w:val="hybridMultilevel"/>
+    <w:tmpl w:val="62DE4202"/>
+    <w:lvl w:ilvl="0" w:tplc="0809000F">
+      <w:start w:val="1"/>
+      <w:numFmt w:val="decimal"/>
+      <w:lvlText w:val="%1."/>
+      <w:lvlJc w:val="left"/>
+      <w:pPr>
+        <w:ind w:left="720" w:hanging="360"/>
+      </w:pPr>
+      <w:rPr>
+        <w:rFonts w:hint="default"/>
+      </w:rPr>
+    </w:lvl>
+    <w:lvl w:ilvl="1" w:tplc="08090019">
+      <w:start w:val="1"/>
+      <w:numFmt w:val="lowerLetter"/>
+      <w:lvlText w:val="%2."/>
+      <w:lvlJc w:val="left"/>
+      <w:pPr>
+        <w:ind w:left="1440" w:hanging="360"/>
+      </w:pPr>
+    </w:lvl>
+    <w:lvl w:ilvl="2" w:tplc="0809001B">
+      <w:start w:val="1"/>
+      <w:numFmt w:val="lowerRoman"/>
+      <w:lvlText w:val="%3."/>
+      <w:lvlJc w:val="right"/>
+      <w:pPr>
+        <w:ind w:left="2160" w:hanging="180"/>
+      </w:pPr>
+    </w:lvl>
+    <w:lvl w:ilvl="3" w:tplc="0809000F" w:tentative="1">
+      <w:start w:val="1"/>
+      <w:numFmt w:val="decimal"/>
+      <w:lvlText w:val="%4."/>
+      <w:lvlJc w:val="left"/>
+      <w:pPr>
+        <w:ind w:left="2880" w:hanging="360"/>
+      </w:pPr>
+    </w:lvl>
+    <w:lvl w:ilvl="4" w:tplc="08090019" w:tentative="1">
+      <w:start w:val="1"/>
+      <w:numFmt w:val="lowerLetter"/>
+      <w:lvlText w:val="%5."/>
+      <w:lvlJc w:val="left"/>
+      <w:pPr>
+        <w:ind w:left="3600" w:hanging="360"/>
+      </w:pPr>
+    </w:lvl>
+    <w:lvl w:ilvl="5" w:tplc="0809001B" w:tentative="1">
+      <w:start w:val="1"/>
+      <w:numFmt w:val="lowerRoman"/>
+      <w:lvlText w:val="%6."/>
+      <w:lvlJc w:val="right"/>
+      <w:pPr>
+        <w:ind w:left="4320" w:hanging="180"/>
+      </w:pPr>
+    </w:lvl>
+    <w:lvl w:ilvl="6" w:tplc="0809000F" w:tentative="1">
+      <w:start w:val="1"/>
+      <w:numFmt w:val="decimal"/>
+      <w:lvlText w:val="%7."/>
+      <w:lvlJc w:val="left"/>
+      <w:pPr>
+        <w:ind w:left="5040" w:hanging="360"/>
+      </w:pPr>
+    </w:lvl>
+    <w:lvl w:ilvl="7" w:tplc="08090019" w:tentative="1">
+      <w:start w:val="1"/>
+      <w:numFmt w:val="lowerLetter"/>
+      <w:lvlText w:val="%8."/>
+      <w:lvlJc w:val="left"/>
+      <w:pPr>
+        <w:ind w:left="5760" w:hanging="360"/>
+      </w:pPr>
+    </w:lvl>
+    <w:lvl w:ilvl="8" w:tplc="0809001B" w:tentative="1">
+      <w:start w:val="1"/>
+      <w:numFmt w:val="lowerRoman"/>
+      <w:lvlText w:val="%9."/>
+      <w:lvlJc w:val="right"/>
+      <w:pPr>
+        <w:ind w:left="6480" w:hanging="180"/>
+      </w:pPr>
+    </w:lvl>
+  </w:abstractNum>
+  <w:abstractNum w:abstractNumId="1" w15:restartNumberingAfterBreak="0">
+    <w:nsid w:val="12976C58"/>
+    <w:multiLevelType w:val="hybridMultilevel"/>
+    <w:tmpl w:val="622A45AA"/>
+    <w:lvl w:ilvl="0" w:tplc="0809000F">
+      <w:start w:val="1"/>
+      <w:numFmt w:val="decimal"/>
+      <w:lvlText w:val="%1."/>
+      <w:lvlJc w:val="left"/>
+      <w:pPr>
+        <w:ind w:left="1080" w:hanging="360"/>
+      </w:pPr>
+    </w:lvl>
+    <w:lvl w:ilvl="1" w:tplc="08090019" w:tentative="1">
+      <w:start w:val="1"/>
+      <w:numFmt w:val="lowerLetter"/>
+      <w:lvlText w:val="%2."/>
+      <w:lvlJc w:val="left"/>
+      <w:pPr>
+        <w:ind w:left="1800" w:hanging="360"/>
+      </w:pPr>
+    </w:lvl>
+    <w:lvl w:ilvl="2" w:tplc="0809001B" w:tentative="1">
+      <w:start w:val="1"/>
+      <w:numFmt w:val="lowerRoman"/>
+      <w:lvlText w:val="%3."/>
+      <w:lvlJc w:val="right"/>
+      <w:pPr>
+        <w:ind w:left="2520" w:hanging="180"/>
+      </w:pPr>
+    </w:lvl>
+    <w:lvl w:ilvl="3" w:tplc="0809000F" w:tentative="1">
+      <w:start w:val="1"/>
+      <w:numFmt w:val="decimal"/>
+      <w:lvlText w:val="%4."/>
+      <w:lvlJc w:val="left"/>
+      <w:pPr>
+        <w:ind w:left="3240" w:hanging="360"/>
+      </w:pPr>
+    </w:lvl>
+    <w:lvl w:ilvl="4" w:tplc="08090019" w:tentative="1">
+      <w:start w:val="1"/>
+      <w:numFmt w:val="lowerLetter"/>
+      <w:lvlText w:val="%5."/>
+      <w:lvlJc w:val="left"/>
+      <w:pPr>
+        <w:ind w:left="3960" w:hanging="360"/>
+      </w:pPr>
+    </w:lvl>
+    <w:lvl w:ilvl="5" w:tplc="0809001B" w:tentative="1">
+      <w:start w:val="1"/>
+      <w:numFmt w:val="lowerRoman"/>
+      <w:lvlText w:val="%6."/>
+      <w:lvlJc w:val="right"/>
+      <w:pPr>
+        <w:ind w:left="4680" w:hanging="180"/>
+      </w:pPr>
+    </w:lvl>
+    <w:lvl w:ilvl="6" w:tplc="0809000F" w:tentative="1">
+      <w:start w:val="1"/>
+      <w:numFmt w:val="decimal"/>
+      <w:lvlText w:val="%7."/>
+      <w:lvlJc w:val="left"/>
+      <w:pPr>
+        <w:ind w:left="5400" w:hanging="360"/>
+      </w:pPr>
+    </w:lvl>
+    <w:lvl w:ilvl="7" w:tplc="08090019" w:tentative="1">
+      <w:start w:val="1"/>
+      <w:numFmt w:val="lowerLetter"/>
+      <w:lvlText w:val="%8."/>
+      <w:lvlJc w:val="left"/>
+      <w:pPr>
+        <w:ind w:left="6120" w:hanging="360"/>
+      </w:pPr>
+    </w:lvl>
+    <w:lvl w:ilvl="8" w:tplc="0809001B" w:tentative="1">
+      <w:start w:val="1"/>
+      <w:numFmt w:val="lowerRoman"/>
+      <w:lvlText w:val="%9."/>
+      <w:lvlJc w:val="right"/>
+      <w:pPr>
+        <w:ind w:left="6840" w:hanging="180"/>
+      </w:pPr>
+    </w:lvl>
+  </w:abstractNum>
+  <w:abstractNum w:abstractNumId="2" w15:restartNumberingAfterBreak="0">
     <w:nsid w:val="14C612B6"/>
     <w:multiLevelType w:val="hybridMultilevel"/>
     <w:tmpl w:val="00A29352"/>
@@ -498,7 +1719,7 @@
         <w:rFonts w:ascii="Symbol" w:hAnsi="Symbol" w:hint="default"/>
       </w:rPr>
     </w:lvl>
-    <w:lvl w:ilvl="1" w:tplc="08090003" w:tentative="1">
+    <w:lvl w:ilvl="1" w:tplc="08090003">
       <w:start w:val="1"/>
       <w:numFmt w:val="bullet"/>
       <w:lvlText w:val="o"/>
@@ -595,7 +1816,319 @@
       </w:rPr>
     </w:lvl>
   </w:abstractNum>
-  <w:abstractNum w:abstractNumId="1" w15:restartNumberingAfterBreak="0">
+  <w:abstractNum w:abstractNumId="3" w15:restartNumberingAfterBreak="0">
+    <w:nsid w:val="2C920AAD"/>
+    <w:multiLevelType w:val="hybridMultilevel"/>
+    <w:tmpl w:val="757A64A4"/>
+    <w:lvl w:ilvl="0" w:tplc="08090001">
+      <w:start w:val="1"/>
+      <w:numFmt w:val="bullet"/>
+      <w:lvlText w:val=""/>
+      <w:lvlJc w:val="left"/>
+      <w:pPr>
+        <w:ind w:left="720" w:hanging="360"/>
+      </w:pPr>
+      <w:rPr>
+        <w:rFonts w:ascii="Symbol" w:hAnsi="Symbol" w:hint="default"/>
+      </w:rPr>
+    </w:lvl>
+    <w:lvl w:ilvl="1" w:tplc="08090003">
+      <w:start w:val="1"/>
+      <w:numFmt w:val="bullet"/>
+      <w:lvlText w:val="o"/>
+      <w:lvlJc w:val="left"/>
+      <w:pPr>
+        <w:ind w:left="1440" w:hanging="360"/>
+      </w:pPr>
+      <w:rPr>
+        <w:rFonts w:ascii="Courier New" w:hAnsi="Courier New" w:cs="Courier New" w:hint="default"/>
+      </w:rPr>
+    </w:lvl>
+    <w:lvl w:ilvl="2" w:tplc="08090005">
+      <w:start w:val="1"/>
+      <w:numFmt w:val="bullet"/>
+      <w:lvlText w:val=""/>
+      <w:lvlJc w:val="left"/>
+      <w:pPr>
+        <w:ind w:left="2160" w:hanging="360"/>
+      </w:pPr>
+      <w:rPr>
+        <w:rFonts w:ascii="Wingdings" w:hAnsi="Wingdings" w:hint="default"/>
+      </w:rPr>
+    </w:lvl>
+    <w:lvl w:ilvl="3" w:tplc="08090001">
+      <w:start w:val="1"/>
+      <w:numFmt w:val="bullet"/>
+      <w:lvlText w:val=""/>
+      <w:lvlJc w:val="left"/>
+      <w:pPr>
+        <w:ind w:left="2880" w:hanging="360"/>
+      </w:pPr>
+      <w:rPr>
+        <w:rFonts w:ascii="Symbol" w:hAnsi="Symbol" w:hint="default"/>
+      </w:rPr>
+    </w:lvl>
+    <w:lvl w:ilvl="4" w:tplc="08090003" w:tentative="1">
+      <w:start w:val="1"/>
+      <w:numFmt w:val="bullet"/>
+      <w:lvlText w:val="o"/>
+      <w:lvlJc w:val="left"/>
+      <w:pPr>
+        <w:ind w:left="3600" w:hanging="360"/>
+      </w:pPr>
+      <w:rPr>
+        <w:rFonts w:ascii="Courier New" w:hAnsi="Courier New" w:cs="Courier New" w:hint="default"/>
+      </w:rPr>
+    </w:lvl>
+    <w:lvl w:ilvl="5" w:tplc="08090005" w:tentative="1">
+      <w:start w:val="1"/>
+      <w:numFmt w:val="bullet"/>
+      <w:lvlText w:val=""/>
+      <w:lvlJc w:val="left"/>
+      <w:pPr>
+        <w:ind w:left="4320" w:hanging="360"/>
+      </w:pPr>
+      <w:rPr>
+        <w:rFonts w:ascii="Wingdings" w:hAnsi="Wingdings" w:hint="default"/>
+      </w:rPr>
+    </w:lvl>
+    <w:lvl w:ilvl="6" w:tplc="08090001" w:tentative="1">
+      <w:start w:val="1"/>
+      <w:numFmt w:val="bullet"/>
+      <w:lvlText w:val=""/>
+      <w:lvlJc w:val="left"/>
+      <w:pPr>
+        <w:ind w:left="5040" w:hanging="360"/>
+      </w:pPr>
+      <w:rPr>
+        <w:rFonts w:ascii="Symbol" w:hAnsi="Symbol" w:hint="default"/>
+      </w:rPr>
+    </w:lvl>
+    <w:lvl w:ilvl="7" w:tplc="08090003" w:tentative="1">
+      <w:start w:val="1"/>
+      <w:numFmt w:val="bullet"/>
+      <w:lvlText w:val="o"/>
+      <w:lvlJc w:val="left"/>
+      <w:pPr>
+        <w:ind w:left="5760" w:hanging="360"/>
+      </w:pPr>
+      <w:rPr>
+        <w:rFonts w:ascii="Courier New" w:hAnsi="Courier New" w:cs="Courier New" w:hint="default"/>
+      </w:rPr>
+    </w:lvl>
+    <w:lvl w:ilvl="8" w:tplc="08090005" w:tentative="1">
+      <w:start w:val="1"/>
+      <w:numFmt w:val="bullet"/>
+      <w:lvlText w:val=""/>
+      <w:lvlJc w:val="left"/>
+      <w:pPr>
+        <w:ind w:left="6480" w:hanging="360"/>
+      </w:pPr>
+      <w:rPr>
+        <w:rFonts w:ascii="Wingdings" w:hAnsi="Wingdings" w:hint="default"/>
+      </w:rPr>
+    </w:lvl>
+  </w:abstractNum>
+  <w:abstractNum w:abstractNumId="4" w15:restartNumberingAfterBreak="0">
+    <w:nsid w:val="377E133E"/>
+    <w:multiLevelType w:val="hybridMultilevel"/>
+    <w:tmpl w:val="5040FF22"/>
+    <w:lvl w:ilvl="0" w:tplc="08090001">
+      <w:start w:val="1"/>
+      <w:numFmt w:val="bullet"/>
+      <w:lvlText w:val=""/>
+      <w:lvlJc w:val="left"/>
+      <w:pPr>
+        <w:ind w:left="720" w:hanging="360"/>
+      </w:pPr>
+      <w:rPr>
+        <w:rFonts w:ascii="Symbol" w:hAnsi="Symbol" w:hint="default"/>
+      </w:rPr>
+    </w:lvl>
+    <w:lvl w:ilvl="1" w:tplc="08090003">
+      <w:start w:val="1"/>
+      <w:numFmt w:val="bullet"/>
+      <w:lvlText w:val="o"/>
+      <w:lvlJc w:val="left"/>
+      <w:pPr>
+        <w:ind w:left="1440" w:hanging="360"/>
+      </w:pPr>
+      <w:rPr>
+        <w:rFonts w:ascii="Courier New" w:hAnsi="Courier New" w:cs="Courier New" w:hint="default"/>
+      </w:rPr>
+    </w:lvl>
+    <w:lvl w:ilvl="2" w:tplc="08090005" w:tentative="1">
+      <w:start w:val="1"/>
+      <w:numFmt w:val="bullet"/>
+      <w:lvlText w:val=""/>
+      <w:lvlJc w:val="left"/>
+      <w:pPr>
+        <w:ind w:left="2160" w:hanging="360"/>
+      </w:pPr>
+      <w:rPr>
+        <w:rFonts w:ascii="Wingdings" w:hAnsi="Wingdings" w:hint="default"/>
+      </w:rPr>
+    </w:lvl>
+    <w:lvl w:ilvl="3" w:tplc="08090001" w:tentative="1">
+      <w:start w:val="1"/>
+      <w:numFmt w:val="bullet"/>
+      <w:lvlText w:val=""/>
+      <w:lvlJc w:val="left"/>
+      <w:pPr>
+        <w:ind w:left="2880" w:hanging="360"/>
+      </w:pPr>
+      <w:rPr>
+        <w:rFonts w:ascii="Symbol" w:hAnsi="Symbol" w:hint="default"/>
+      </w:rPr>
+    </w:lvl>
+    <w:lvl w:ilvl="4" w:tplc="08090003" w:tentative="1">
+      <w:start w:val="1"/>
+      <w:numFmt w:val="bullet"/>
+      <w:lvlText w:val="o"/>
+      <w:lvlJc w:val="left"/>
+      <w:pPr>
+        <w:ind w:left="3600" w:hanging="360"/>
+      </w:pPr>
+      <w:rPr>
+        <w:rFonts w:ascii="Courier New" w:hAnsi="Courier New" w:cs="Courier New" w:hint="default"/>
+      </w:rPr>
+    </w:lvl>
+    <w:lvl w:ilvl="5" w:tplc="08090005" w:tentative="1">
+      <w:start w:val="1"/>
+      <w:numFmt w:val="bullet"/>
+      <w:lvlText w:val=""/>
+      <w:lvlJc w:val="left"/>
+      <w:pPr>
+        <w:ind w:left="4320" w:hanging="360"/>
+      </w:pPr>
+      <w:rPr>
+        <w:rFonts w:ascii="Wingdings" w:hAnsi="Wingdings" w:hint="default"/>
+      </w:rPr>
+    </w:lvl>
+    <w:lvl w:ilvl="6" w:tplc="08090001" w:tentative="1">
+      <w:start w:val="1"/>
+      <w:numFmt w:val="bullet"/>
+      <w:lvlText w:val=""/>
+      <w:lvlJc w:val="left"/>
+      <w:pPr>
+        <w:ind w:left="5040" w:hanging="360"/>
+      </w:pPr>
+      <w:rPr>
+        <w:rFonts w:ascii="Symbol" w:hAnsi="Symbol" w:hint="default"/>
+      </w:rPr>
+    </w:lvl>
+    <w:lvl w:ilvl="7" w:tplc="08090003" w:tentative="1">
+      <w:start w:val="1"/>
+      <w:numFmt w:val="bullet"/>
+      <w:lvlText w:val="o"/>
+      <w:lvlJc w:val="left"/>
+      <w:pPr>
+        <w:ind w:left="5760" w:hanging="360"/>
+      </w:pPr>
+      <w:rPr>
+        <w:rFonts w:ascii="Courier New" w:hAnsi="Courier New" w:cs="Courier New" w:hint="default"/>
+      </w:rPr>
+    </w:lvl>
+    <w:lvl w:ilvl="8" w:tplc="08090005" w:tentative="1">
+      <w:start w:val="1"/>
+      <w:numFmt w:val="bullet"/>
+      <w:lvlText w:val=""/>
+      <w:lvlJc w:val="left"/>
+      <w:pPr>
+        <w:ind w:left="6480" w:hanging="360"/>
+      </w:pPr>
+      <w:rPr>
+        <w:rFonts w:ascii="Wingdings" w:hAnsi="Wingdings" w:hint="default"/>
+      </w:rPr>
+    </w:lvl>
+  </w:abstractNum>
+  <w:abstractNum w:abstractNumId="5" w15:restartNumberingAfterBreak="0">
+    <w:nsid w:val="67D17D62"/>
+    <w:multiLevelType w:val="hybridMultilevel"/>
+    <w:tmpl w:val="E0105CF8"/>
+    <w:lvl w:ilvl="0" w:tplc="0809000F">
+      <w:start w:val="1"/>
+      <w:numFmt w:val="decimal"/>
+      <w:lvlText w:val="%1."/>
+      <w:lvlJc w:val="left"/>
+      <w:pPr>
+        <w:ind w:left="1080" w:hanging="360"/>
+      </w:pPr>
+    </w:lvl>
+    <w:lvl w:ilvl="1" w:tplc="08090019">
+      <w:start w:val="1"/>
+      <w:numFmt w:val="lowerLetter"/>
+      <w:lvlText w:val="%2."/>
+      <w:lvlJc w:val="left"/>
+      <w:pPr>
+        <w:ind w:left="1800" w:hanging="360"/>
+      </w:pPr>
+    </w:lvl>
+    <w:lvl w:ilvl="2" w:tplc="0809001B">
+      <w:start w:val="1"/>
+      <w:numFmt w:val="lowerRoman"/>
+      <w:lvlText w:val="%3."/>
+      <w:lvlJc w:val="right"/>
+      <w:pPr>
+        <w:ind w:left="2520" w:hanging="180"/>
+      </w:pPr>
+    </w:lvl>
+    <w:lvl w:ilvl="3" w:tplc="0809000F" w:tentative="1">
+      <w:start w:val="1"/>
+      <w:numFmt w:val="decimal"/>
+      <w:lvlText w:val="%4."/>
+      <w:lvlJc w:val="left"/>
+      <w:pPr>
+        <w:ind w:left="3240" w:hanging="360"/>
+      </w:pPr>
+    </w:lvl>
+    <w:lvl w:ilvl="4" w:tplc="08090019" w:tentative="1">
+      <w:start w:val="1"/>
+      <w:numFmt w:val="lowerLetter"/>
+      <w:lvlText w:val="%5."/>
+      <w:lvlJc w:val="left"/>
+      <w:pPr>
+        <w:ind w:left="3960" w:hanging="360"/>
+      </w:pPr>
+    </w:lvl>
+    <w:lvl w:ilvl="5" w:tplc="0809001B" w:tentative="1">
+      <w:start w:val="1"/>
+      <w:numFmt w:val="lowerRoman"/>
+      <w:lvlText w:val="%6."/>
+      <w:lvlJc w:val="right"/>
+      <w:pPr>
+        <w:ind w:left="4680" w:hanging="180"/>
+      </w:pPr>
+    </w:lvl>
+    <w:lvl w:ilvl="6" w:tplc="0809000F" w:tentative="1">
+      <w:start w:val="1"/>
+      <w:numFmt w:val="decimal"/>
+      <w:lvlText w:val="%7."/>
+      <w:lvlJc w:val="left"/>
+      <w:pPr>
+        <w:ind w:left="5400" w:hanging="360"/>
+      </w:pPr>
+    </w:lvl>
+    <w:lvl w:ilvl="7" w:tplc="08090019" w:tentative="1">
+      <w:start w:val="1"/>
+      <w:numFmt w:val="lowerLetter"/>
+      <w:lvlText w:val="%8."/>
+      <w:lvlJc w:val="left"/>
+      <w:pPr>
+        <w:ind w:left="6120" w:hanging="360"/>
+      </w:pPr>
+    </w:lvl>
+    <w:lvl w:ilvl="8" w:tplc="0809001B" w:tentative="1">
+      <w:start w:val="1"/>
+      <w:numFmt w:val="lowerRoman"/>
+      <w:lvlText w:val="%9."/>
+      <w:lvlJc w:val="right"/>
+      <w:pPr>
+        <w:ind w:left="6840" w:hanging="180"/>
+      </w:pPr>
+    </w:lvl>
+  </w:abstractNum>
+  <w:abstractNum w:abstractNumId="6" w15:restartNumberingAfterBreak="0">
     <w:nsid w:val="746A5C0A"/>
     <w:multiLevelType w:val="hybridMultilevel"/>
     <w:tmpl w:val="50DEA51A"/>
@@ -708,11 +2241,115 @@
       </w:rPr>
     </w:lvl>
   </w:abstractNum>
+  <w:abstractNum w:abstractNumId="7" w15:restartNumberingAfterBreak="0">
+    <w:nsid w:val="7D5203AC"/>
+    <w:multiLevelType w:val="hybridMultilevel"/>
+    <w:tmpl w:val="10DAC126"/>
+    <w:lvl w:ilvl="0" w:tplc="0809000F">
+      <w:start w:val="1"/>
+      <w:numFmt w:val="decimal"/>
+      <w:lvlText w:val="%1."/>
+      <w:lvlJc w:val="left"/>
+      <w:pPr>
+        <w:ind w:left="1080" w:hanging="360"/>
+      </w:pPr>
+    </w:lvl>
+    <w:lvl w:ilvl="1" w:tplc="08090019">
+      <w:start w:val="1"/>
+      <w:numFmt w:val="lowerLetter"/>
+      <w:lvlText w:val="%2."/>
+      <w:lvlJc w:val="left"/>
+      <w:pPr>
+        <w:ind w:left="1800" w:hanging="360"/>
+      </w:pPr>
+    </w:lvl>
+    <w:lvl w:ilvl="2" w:tplc="0809001B">
+      <w:start w:val="1"/>
+      <w:numFmt w:val="lowerRoman"/>
+      <w:lvlText w:val="%3."/>
+      <w:lvlJc w:val="right"/>
+      <w:pPr>
+        <w:ind w:left="2520" w:hanging="180"/>
+      </w:pPr>
+    </w:lvl>
+    <w:lvl w:ilvl="3" w:tplc="0809000F">
+      <w:start w:val="1"/>
+      <w:numFmt w:val="decimal"/>
+      <w:lvlText w:val="%4."/>
+      <w:lvlJc w:val="left"/>
+      <w:pPr>
+        <w:ind w:left="3240" w:hanging="360"/>
+      </w:pPr>
+    </w:lvl>
+    <w:lvl w:ilvl="4" w:tplc="08090019" w:tentative="1">
+      <w:start w:val="1"/>
+      <w:numFmt w:val="lowerLetter"/>
+      <w:lvlText w:val="%5."/>
+      <w:lvlJc w:val="left"/>
+      <w:pPr>
+        <w:ind w:left="3960" w:hanging="360"/>
+      </w:pPr>
+    </w:lvl>
+    <w:lvl w:ilvl="5" w:tplc="0809001B" w:tentative="1">
+      <w:start w:val="1"/>
+      <w:numFmt w:val="lowerRoman"/>
+      <w:lvlText w:val="%6."/>
+      <w:lvlJc w:val="right"/>
+      <w:pPr>
+        <w:ind w:left="4680" w:hanging="180"/>
+      </w:pPr>
+    </w:lvl>
+    <w:lvl w:ilvl="6" w:tplc="0809000F" w:tentative="1">
+      <w:start w:val="1"/>
+      <w:numFmt w:val="decimal"/>
+      <w:lvlText w:val="%7."/>
+      <w:lvlJc w:val="left"/>
+      <w:pPr>
+        <w:ind w:left="5400" w:hanging="360"/>
+      </w:pPr>
+    </w:lvl>
+    <w:lvl w:ilvl="7" w:tplc="08090019" w:tentative="1">
+      <w:start w:val="1"/>
+      <w:numFmt w:val="lowerLetter"/>
+      <w:lvlText w:val="%8."/>
+      <w:lvlJc w:val="left"/>
+      <w:pPr>
+        <w:ind w:left="6120" w:hanging="360"/>
+      </w:pPr>
+    </w:lvl>
+    <w:lvl w:ilvl="8" w:tplc="0809001B" w:tentative="1">
+      <w:start w:val="1"/>
+      <w:numFmt w:val="lowerRoman"/>
+      <w:lvlText w:val="%9."/>
+      <w:lvlJc w:val="right"/>
+      <w:pPr>
+        <w:ind w:left="6840" w:hanging="180"/>
+      </w:pPr>
+    </w:lvl>
+  </w:abstractNum>
   <w:num w:numId="1" w16cid:durableId="853226515">
+    <w:abstractNumId w:val="6"/>
+  </w:num>
+  <w:num w:numId="2" w16cid:durableId="1165441885">
+    <w:abstractNumId w:val="2"/>
+  </w:num>
+  <w:num w:numId="3" w16cid:durableId="34241236">
+    <w:abstractNumId w:val="5"/>
+  </w:num>
+  <w:num w:numId="4" w16cid:durableId="309870290">
+    <w:abstractNumId w:val="0"/>
+  </w:num>
+  <w:num w:numId="5" w16cid:durableId="778842978">
+    <w:abstractNumId w:val="7"/>
+  </w:num>
+  <w:num w:numId="6" w16cid:durableId="386995064">
     <w:abstractNumId w:val="1"/>
   </w:num>
-  <w:num w:numId="2" w16cid:durableId="1165441885">
-    <w:abstractNumId w:val="0"/>
+  <w:num w:numId="7" w16cid:durableId="24985334">
+    <w:abstractNumId w:val="4"/>
+  </w:num>
+  <w:num w:numId="8" w16cid:durableId="898711683">
+    <w:abstractNumId w:val="3"/>
   </w:num>
 </w:numbering>
 </file>

</xml_diff>